<commit_message>
docs: update the diagrams
</commit_message>
<xml_diff>
--- a/documentation/SWE/SRS_v3.docx
+++ b/documentation/SWE/SRS_v3.docx
@@ -602,13 +602,8 @@
                               <w:bidi w:val="0"/>
                             </w:pPr>
                             <w:r>
-                              <w:t xml:space="preserve">Eng. Rasheed </w:t>
+                              <w:t>Eng. Rasheed Aldhaferi</w:t>
                             </w:r>
-                            <w:proofErr w:type="spellStart"/>
-                            <w:r>
-                              <w:t>Aldhaferi</w:t>
-                            </w:r>
-                            <w:proofErr w:type="spellEnd"/>
                           </w:p>
                           <w:p>
                             <w:pPr>
@@ -2471,21 +2466,7 @@
                 <w:rStyle w:val="Hyperlink"/>
                 <w:noProof/>
               </w:rPr>
-              <w:t>Functio</w:t>
-            </w:r>
-            <w:r>
-              <w:rPr>
-                <w:rStyle w:val="Hyperlink"/>
-                <w:noProof/>
-              </w:rPr>
-              <w:t>n</w:t>
-            </w:r>
-            <w:r>
-              <w:rPr>
-                <w:rStyle w:val="Hyperlink"/>
-                <w:noProof/>
-              </w:rPr>
-              <w:t>al Requirements</w:t>
+              <w:t>Functional Requirements</w:t>
             </w:r>
             <w:r>
               <w:rPr>
@@ -3282,21 +3263,7 @@
                 <w:rStyle w:val="Hyperlink"/>
                 <w:noProof/>
               </w:rPr>
-              <w:t>Busines</w:t>
-            </w:r>
-            <w:r>
-              <w:rPr>
-                <w:rStyle w:val="Hyperlink"/>
-                <w:noProof/>
-              </w:rPr>
-              <w:t>s</w:t>
-            </w:r>
-            <w:r>
-              <w:rPr>
-                <w:rStyle w:val="Hyperlink"/>
-                <w:noProof/>
-              </w:rPr>
-              <w:t xml:space="preserve"> Rules</w:t>
+              <w:t>Business Rules</w:t>
             </w:r>
             <w:r>
               <w:rPr>
@@ -7312,25 +7279,7 @@
                 <w:sz w:val="20"/>
                 <w:szCs w:val="20"/>
               </w:rPr>
-              <w:t xml:space="preserve">Eng. Rasheed </w:t>
-            </w:r>
-            <w:proofErr w:type="spellStart"/>
-            <w:r>
-              <w:rPr>
-                <w:color w:val="000000"/>
-                <w:sz w:val="20"/>
-                <w:szCs w:val="20"/>
-              </w:rPr>
-              <w:t>Aldhaferi</w:t>
-            </w:r>
-            <w:proofErr w:type="spellEnd"/>
-            <w:r>
-              <w:rPr>
-                <w:color w:val="000000"/>
-                <w:sz w:val="20"/>
-                <w:szCs w:val="20"/>
-              </w:rPr>
-              <w:t xml:space="preserve"> (Instructor / Sponsor)</w:t>
+              <w:t>Eng. Rasheed Aldhaferi (Instructor / Sponsor)</w:t>
             </w:r>
           </w:p>
         </w:tc>
@@ -7526,44 +7475,16 @@
                 <w:sz w:val="20"/>
                 <w:szCs w:val="20"/>
               </w:rPr>
-              <w:t>Online payment gateways (</w:t>
-            </w:r>
-            <w:proofErr w:type="spellStart"/>
+              <w:t xml:space="preserve">Online payment gateways (Jaib, </w:t>
+            </w:r>
+            <w:proofErr w:type="gramStart"/>
             <w:r>
               <w:rPr>
                 <w:color w:val="000000" w:themeColor="text1"/>
                 <w:sz w:val="20"/>
                 <w:szCs w:val="20"/>
               </w:rPr>
-              <w:t>Jaib</w:t>
-            </w:r>
-            <w:proofErr w:type="spellEnd"/>
-            <w:r>
-              <w:rPr>
-                <w:color w:val="000000" w:themeColor="text1"/>
-                <w:sz w:val="20"/>
-                <w:szCs w:val="20"/>
-              </w:rPr>
-              <w:t xml:space="preserve">, </w:t>
-            </w:r>
-            <w:proofErr w:type="spellStart"/>
-            <w:proofErr w:type="gramStart"/>
-            <w:r>
-              <w:rPr>
-                <w:color w:val="000000" w:themeColor="text1"/>
-                <w:sz w:val="20"/>
-                <w:szCs w:val="20"/>
-              </w:rPr>
-              <w:t>OneCash</w:t>
-            </w:r>
-            <w:proofErr w:type="spellEnd"/>
-            <w:r>
-              <w:rPr>
-                <w:color w:val="000000" w:themeColor="text1"/>
-                <w:sz w:val="20"/>
-                <w:szCs w:val="20"/>
-              </w:rPr>
-              <w:t>,,</w:t>
+              <w:t>OneCash,,</w:t>
             </w:r>
             <w:proofErr w:type="gramEnd"/>
             <w:r>
@@ -11184,25 +11105,7 @@
                 <w:sz w:val="19"/>
                 <w:szCs w:val="19"/>
               </w:rPr>
-              <w:t xml:space="preserve">The system shall automatically calculate and update the status of a monthly </w:t>
-            </w:r>
-            <w:proofErr w:type="spellStart"/>
-            <w:r>
-              <w:rPr>
-                <w:rFonts w:asciiTheme="minorHAnsi" w:hAnsiTheme="minorHAnsi" w:cstheme="minorHAnsi"/>
-                <w:sz w:val="19"/>
-                <w:szCs w:val="19"/>
-              </w:rPr>
-              <w:t>RentPeriod</w:t>
-            </w:r>
-            <w:proofErr w:type="spellEnd"/>
-            <w:r>
-              <w:rPr>
-                <w:rFonts w:asciiTheme="minorHAnsi" w:hAnsiTheme="minorHAnsi" w:cstheme="minorHAnsi"/>
-                <w:sz w:val="19"/>
-                <w:szCs w:val="19"/>
-              </w:rPr>
-              <w:t xml:space="preserve"> as Unpaid, Partial, Paid, Overdue, or Overpaid based on due date, expected rent, and valid </w:t>
+              <w:t xml:space="preserve">The system shall automatically calculate and update the status of a monthly RentPeriod as Unpaid, Partial, Paid, Overdue, or Overpaid based on due date, expected rent, and valid </w:t>
             </w:r>
             <w:r>
               <w:rPr>
@@ -11462,27 +11365,7 @@
                 <w:sz w:val="19"/>
                 <w:szCs w:val="19"/>
               </w:rPr>
-              <w:t xml:space="preserve">The system shall allow the Apartment Manager or Owner to void or correct a </w:t>
-            </w:r>
-            <w:proofErr w:type="spellStart"/>
-            <w:r>
-              <w:rPr>
-                <w:rFonts w:asciiTheme="minorHAnsi" w:hAnsiTheme="minorHAnsi" w:cstheme="minorHAnsi"/>
-                <w:color w:val="000000"/>
-                <w:sz w:val="19"/>
-                <w:szCs w:val="19"/>
-              </w:rPr>
-              <w:t>PaymentRecord</w:t>
-            </w:r>
-            <w:proofErr w:type="spellEnd"/>
-            <w:r>
-              <w:rPr>
-                <w:rFonts w:asciiTheme="minorHAnsi" w:hAnsiTheme="minorHAnsi" w:cstheme="minorHAnsi"/>
-                <w:color w:val="000000"/>
-                <w:sz w:val="19"/>
-                <w:szCs w:val="19"/>
-              </w:rPr>
-              <w:t xml:space="preserve"> while requiring a mandatory audit note and maintaining transaction log auditability.</w:t>
+              <w:t>The system shall allow the Apartment Manager or Owner to void or correct a PaymentRecord while requiring a mandatory audit note and maintaining transaction log auditability.</w:t>
             </w:r>
           </w:p>
         </w:tc>
@@ -25568,17 +25451,15 @@
               </w:rPr>
               <w:t xml:space="preserve">The rent status is calculated automatically from due date, </w:t>
             </w:r>
-            <w:proofErr w:type="gramStart"/>
-            <w:r>
-              <w:rPr>
-                <w:rFonts w:asciiTheme="minorHAnsi" w:hAnsiTheme="minorHAnsi" w:cstheme="minorHAnsi"/>
-                <w:color w:val="000000"/>
-                <w:sz w:val="19"/>
-                <w:szCs w:val="19"/>
-              </w:rPr>
-              <w:t>Expected</w:t>
-            </w:r>
-            <w:proofErr w:type="gramEnd"/>
+            <w:r>
+              <w:rPr>
+                <w:rFonts w:asciiTheme="minorHAnsi" w:hAnsiTheme="minorHAnsi" w:cstheme="minorHAnsi"/>
+                <w:color w:val="000000"/>
+                <w:sz w:val="19"/>
+                <w:szCs w:val="19"/>
+              </w:rPr>
+              <w:t>expected</w:t>
+            </w:r>
             <w:r>
               <w:rPr>
                 <w:rFonts w:asciiTheme="minorHAnsi" w:hAnsiTheme="minorHAnsi" w:cstheme="minorHAnsi"/>
@@ -26986,7 +26867,6 @@
                 <w:rFonts w:asciiTheme="minorHAnsi" w:hAnsiTheme="minorHAnsi" w:cstheme="minorHAnsi"/>
               </w:rPr>
             </w:pPr>
-            <w:proofErr w:type="spellStart"/>
             <w:r>
               <w:rPr>
                 <w:rFonts w:asciiTheme="minorHAnsi" w:hAnsiTheme="minorHAnsi" w:cstheme="minorHAnsi"/>
@@ -26996,7 +26876,6 @@
               </w:rPr>
               <w:t>TenantID</w:t>
             </w:r>
-            <w:proofErr w:type="spellEnd"/>
           </w:p>
         </w:tc>
         <w:tc>
@@ -27127,7 +27006,6 @@
                 <w:rFonts w:asciiTheme="minorHAnsi" w:hAnsiTheme="minorHAnsi" w:cstheme="minorHAnsi"/>
               </w:rPr>
             </w:pPr>
-            <w:proofErr w:type="spellStart"/>
             <w:r>
               <w:rPr>
                 <w:rFonts w:asciiTheme="minorHAnsi" w:hAnsiTheme="minorHAnsi" w:cstheme="minorHAnsi"/>
@@ -27137,7 +27015,6 @@
               </w:rPr>
               <w:t>FullName</w:t>
             </w:r>
-            <w:proofErr w:type="spellEnd"/>
           </w:p>
         </w:tc>
         <w:tc>
@@ -27268,7 +27145,6 @@
                 <w:rFonts w:asciiTheme="minorHAnsi" w:hAnsiTheme="minorHAnsi" w:cstheme="minorHAnsi"/>
               </w:rPr>
             </w:pPr>
-            <w:proofErr w:type="spellStart"/>
             <w:r>
               <w:rPr>
                 <w:rFonts w:asciiTheme="minorHAnsi" w:hAnsiTheme="minorHAnsi" w:cstheme="minorHAnsi"/>
@@ -27284,7 +27160,6 @@
               </w:rPr>
               <w:t>Number</w:t>
             </w:r>
-            <w:proofErr w:type="spellEnd"/>
           </w:p>
         </w:tc>
         <w:tc>
@@ -27765,7 +27640,6 @@
                 <w:szCs w:val="19"/>
               </w:rPr>
             </w:pPr>
-            <w:proofErr w:type="spellStart"/>
             <w:r>
               <w:rPr>
                 <w:rFonts w:asciiTheme="minorHAnsi" w:hAnsiTheme="minorHAnsi" w:cstheme="minorHAnsi"/>
@@ -27775,7 +27649,6 @@
               </w:rPr>
               <w:t>ApartmentID</w:t>
             </w:r>
-            <w:proofErr w:type="spellEnd"/>
           </w:p>
         </w:tc>
         <w:tc>
@@ -27912,7 +27785,6 @@
                 <w:szCs w:val="19"/>
               </w:rPr>
             </w:pPr>
-            <w:proofErr w:type="spellStart"/>
             <w:r>
               <w:rPr>
                 <w:rFonts w:asciiTheme="minorHAnsi" w:hAnsiTheme="minorHAnsi" w:cstheme="minorHAnsi"/>
@@ -27922,7 +27794,6 @@
               </w:rPr>
               <w:t>UnitNumber</w:t>
             </w:r>
-            <w:proofErr w:type="spellEnd"/>
           </w:p>
         </w:tc>
         <w:tc>
@@ -28061,25 +27932,14 @@
                 <w:szCs w:val="19"/>
               </w:rPr>
             </w:pPr>
-            <w:proofErr w:type="spellStart"/>
-            <w:r>
-              <w:rPr>
-                <w:rFonts w:asciiTheme="minorHAnsi" w:hAnsiTheme="minorHAnsi" w:cstheme="minorHAnsi"/>
-                <w:color w:val="000000"/>
-                <w:sz w:val="19"/>
-                <w:szCs w:val="19"/>
-              </w:rPr>
-              <w:t>RoomDetails</w:t>
-            </w:r>
-            <w:proofErr w:type="spellEnd"/>
-            <w:r>
-              <w:rPr>
-                <w:rFonts w:asciiTheme="minorHAnsi" w:hAnsiTheme="minorHAnsi" w:cstheme="minorHAnsi"/>
-                <w:color w:val="000000"/>
-                <w:sz w:val="19"/>
-                <w:szCs w:val="19"/>
-              </w:rPr>
-              <w:t xml:space="preserve"> </w:t>
+            <w:r>
+              <w:rPr>
+                <w:rFonts w:asciiTheme="minorHAnsi" w:hAnsiTheme="minorHAnsi" w:cstheme="minorHAnsi"/>
+                <w:color w:val="000000"/>
+                <w:sz w:val="19"/>
+                <w:szCs w:val="19"/>
+              </w:rPr>
+              <w:t xml:space="preserve">RoomDetails </w:t>
             </w:r>
           </w:p>
         </w:tc>
@@ -28216,7 +28076,6 @@
                 <w:szCs w:val="19"/>
               </w:rPr>
             </w:pPr>
-            <w:proofErr w:type="spellStart"/>
             <w:r>
               <w:rPr>
                 <w:rFonts w:asciiTheme="minorHAnsi" w:hAnsiTheme="minorHAnsi" w:cstheme="minorHAnsi"/>
@@ -28226,7 +28085,6 @@
               </w:rPr>
               <w:t>FloorLevel</w:t>
             </w:r>
-            <w:proofErr w:type="spellEnd"/>
           </w:p>
         </w:tc>
         <w:tc>
@@ -28363,7 +28221,6 @@
                 <w:szCs w:val="19"/>
               </w:rPr>
             </w:pPr>
-            <w:proofErr w:type="spellStart"/>
             <w:r>
               <w:rPr>
                 <w:rFonts w:asciiTheme="minorHAnsi" w:hAnsiTheme="minorHAnsi" w:cstheme="minorHAnsi"/>
@@ -28373,7 +28230,6 @@
               </w:rPr>
               <w:t>OccupancyStatus</w:t>
             </w:r>
-            <w:proofErr w:type="spellEnd"/>
           </w:p>
         </w:tc>
         <w:tc>
@@ -28513,11 +28369,9 @@
       </w:pPr>
       <w:bookmarkStart w:id="69" w:name="_Toc240648824"/>
       <w:bookmarkStart w:id="70" w:name="_Toc240648938"/>
-      <w:proofErr w:type="spellStart"/>
       <w:r>
         <w:t>TenantApartmentAssignment</w:t>
       </w:r>
-      <w:proofErr w:type="spellEnd"/>
     </w:p>
     <w:tbl>
       <w:tblPr>
@@ -28708,7 +28562,6 @@
             </w:pPr>
             <w:bookmarkStart w:id="72" w:name="_Hlk240861651"/>
             <w:bookmarkEnd w:id="71"/>
-            <w:proofErr w:type="spellStart"/>
             <w:r>
               <w:rPr>
                 <w:rFonts w:asciiTheme="minorHAnsi" w:hAnsiTheme="minorHAnsi" w:cstheme="minorHAnsi"/>
@@ -28718,7 +28571,6 @@
               </w:rPr>
               <w:t>AssignmentID</w:t>
             </w:r>
-            <w:proofErr w:type="spellEnd"/>
           </w:p>
         </w:tc>
         <w:tc>
@@ -28838,7 +28690,6 @@
                 <w:szCs w:val="19"/>
               </w:rPr>
             </w:pPr>
-            <w:proofErr w:type="spellStart"/>
             <w:r>
               <w:rPr>
                 <w:rFonts w:asciiTheme="minorHAnsi" w:hAnsiTheme="minorHAnsi" w:cstheme="minorHAnsi"/>
@@ -28848,7 +28699,6 @@
               </w:rPr>
               <w:t>TenantID</w:t>
             </w:r>
-            <w:proofErr w:type="spellEnd"/>
           </w:p>
         </w:tc>
         <w:tc>
@@ -28947,16 +28797,7 @@
                 <w:sz w:val="19"/>
                 <w:szCs w:val="19"/>
               </w:rPr>
-              <w:t>FK</w:t>
-            </w:r>
-            <w:r>
-              <w:rPr>
-                <w:rFonts w:asciiTheme="minorHAnsi" w:hAnsiTheme="minorHAnsi" w:cstheme="minorHAnsi"/>
-                <w:color w:val="000000"/>
-                <w:sz w:val="19"/>
-                <w:szCs w:val="19"/>
-              </w:rPr>
-              <w:t>, required</w:t>
+              <w:t>FK, required</w:t>
             </w:r>
           </w:p>
         </w:tc>
@@ -28976,7 +28817,6 @@
                 <w:szCs w:val="19"/>
               </w:rPr>
             </w:pPr>
-            <w:proofErr w:type="spellStart"/>
             <w:r>
               <w:rPr>
                 <w:rFonts w:asciiTheme="minorHAnsi" w:hAnsiTheme="minorHAnsi" w:cstheme="minorHAnsi"/>
@@ -28986,7 +28826,6 @@
               </w:rPr>
               <w:t>ApartmentID</w:t>
             </w:r>
-            <w:proofErr w:type="spellEnd"/>
           </w:p>
         </w:tc>
         <w:tc>
@@ -29085,16 +28924,7 @@
                 <w:sz w:val="19"/>
                 <w:szCs w:val="19"/>
               </w:rPr>
-              <w:t>FK</w:t>
-            </w:r>
-            <w:r>
-              <w:rPr>
-                <w:rFonts w:asciiTheme="minorHAnsi" w:hAnsiTheme="minorHAnsi" w:cstheme="minorHAnsi"/>
-                <w:color w:val="000000"/>
-                <w:sz w:val="19"/>
-                <w:szCs w:val="19"/>
-              </w:rPr>
-              <w:t>, required</w:t>
+              <w:t>FK, required</w:t>
             </w:r>
           </w:p>
         </w:tc>
@@ -29114,7 +28944,6 @@
                 <w:szCs w:val="19"/>
               </w:rPr>
             </w:pPr>
-            <w:proofErr w:type="spellStart"/>
             <w:r>
               <w:rPr>
                 <w:rFonts w:asciiTheme="minorHAnsi" w:hAnsiTheme="minorHAnsi" w:cstheme="minorHAnsi"/>
@@ -29124,7 +28953,6 @@
               </w:rPr>
               <w:t>MoveInDate</w:t>
             </w:r>
-            <w:proofErr w:type="spellEnd"/>
           </w:p>
         </w:tc>
         <w:tc>
@@ -29243,7 +29071,6 @@
                 <w:szCs w:val="19"/>
               </w:rPr>
             </w:pPr>
-            <w:proofErr w:type="spellStart"/>
             <w:r>
               <w:rPr>
                 <w:rFonts w:asciiTheme="minorHAnsi" w:hAnsiTheme="minorHAnsi" w:cstheme="minorHAnsi"/>
@@ -29253,7 +29080,6 @@
               </w:rPr>
               <w:t>MoveOutDate</w:t>
             </w:r>
-            <w:proofErr w:type="spellEnd"/>
           </w:p>
         </w:tc>
         <w:tc>
@@ -29277,25 +29103,7 @@
                 <w:sz w:val="19"/>
                 <w:szCs w:val="19"/>
               </w:rPr>
-              <w:t xml:space="preserve">Occupancy </w:t>
-            </w:r>
-            <w:r>
-              <w:rPr>
-                <w:rFonts w:asciiTheme="minorHAnsi" w:hAnsiTheme="minorHAnsi" w:cstheme="minorHAnsi"/>
-                <w:color w:val="000000"/>
-                <w:sz w:val="19"/>
-                <w:szCs w:val="19"/>
-              </w:rPr>
-              <w:t xml:space="preserve">end </w:t>
-            </w:r>
-            <w:r>
-              <w:rPr>
-                <w:rFonts w:asciiTheme="minorHAnsi" w:hAnsiTheme="minorHAnsi" w:cstheme="minorHAnsi"/>
-                <w:color w:val="000000"/>
-                <w:sz w:val="19"/>
-                <w:szCs w:val="19"/>
-              </w:rPr>
-              <w:t>date</w:t>
+              <w:t>Occupancy end date</w:t>
             </w:r>
           </w:p>
         </w:tc>
@@ -29379,19 +29187,8 @@
                 <w:sz w:val="19"/>
                 <w:szCs w:val="19"/>
               </w:rPr>
-              <w:t xml:space="preserve">Must be &gt; </w:t>
-            </w:r>
-            <w:proofErr w:type="spellStart"/>
-            <w:r>
-              <w:rPr>
-                <w:rFonts w:asciiTheme="minorHAnsi" w:hAnsiTheme="minorHAnsi" w:cstheme="minorHAnsi"/>
-                <w:color w:val="000000"/>
-                <w:sz w:val="19"/>
-                <w:szCs w:val="19"/>
-              </w:rPr>
-              <w:t>MoveInDate</w:t>
-            </w:r>
-            <w:proofErr w:type="spellEnd"/>
+              <w:t>Must be &gt; MoveInDate</w:t>
+            </w:r>
           </w:p>
         </w:tc>
       </w:tr>
@@ -29400,11 +29197,9 @@
       <w:pPr>
         <w:pStyle w:val="3"/>
       </w:pPr>
-      <w:proofErr w:type="spellStart"/>
       <w:r>
         <w:t>RentConfiguration</w:t>
       </w:r>
-      <w:proofErr w:type="spellEnd"/>
     </w:p>
     <w:tbl>
       <w:tblPr>
@@ -29594,7 +29389,6 @@
                 <w:szCs w:val="19"/>
               </w:rPr>
             </w:pPr>
-            <w:proofErr w:type="spellStart"/>
             <w:r>
               <w:rPr>
                 <w:rFonts w:asciiTheme="minorHAnsi" w:hAnsiTheme="minorHAnsi" w:cstheme="minorHAnsi"/>
@@ -29604,7 +29398,6 @@
               </w:rPr>
               <w:t>ConfigID</w:t>
             </w:r>
-            <w:proofErr w:type="spellEnd"/>
           </w:p>
         </w:tc>
         <w:tc>
@@ -29723,7 +29516,6 @@
                 <w:szCs w:val="19"/>
               </w:rPr>
             </w:pPr>
-            <w:proofErr w:type="spellStart"/>
             <w:r>
               <w:rPr>
                 <w:rFonts w:asciiTheme="minorHAnsi" w:hAnsiTheme="minorHAnsi" w:cstheme="minorHAnsi"/>
@@ -29733,7 +29525,6 @@
               </w:rPr>
               <w:t>ApartmentID</w:t>
             </w:r>
-            <w:proofErr w:type="spellEnd"/>
           </w:p>
         </w:tc>
         <w:tc>
@@ -29841,25 +29632,7 @@
                 <w:sz w:val="19"/>
                 <w:szCs w:val="19"/>
               </w:rPr>
-              <w:t>,</w:t>
-            </w:r>
-            <w:r>
-              <w:rPr>
-                <w:rFonts w:asciiTheme="minorHAnsi" w:hAnsiTheme="minorHAnsi" w:cstheme="minorHAnsi"/>
-                <w:color w:val="000000"/>
-                <w:sz w:val="19"/>
-                <w:szCs w:val="19"/>
-              </w:rPr>
-              <w:t xml:space="preserve"> </w:t>
-            </w:r>
-            <w:r>
-              <w:rPr>
-                <w:rFonts w:asciiTheme="minorHAnsi" w:hAnsiTheme="minorHAnsi" w:cstheme="minorHAnsi"/>
-                <w:color w:val="000000"/>
-                <w:sz w:val="19"/>
-                <w:szCs w:val="19"/>
-              </w:rPr>
-              <w:t>required</w:t>
+              <w:t>, required</w:t>
             </w:r>
           </w:p>
         </w:tc>
@@ -29879,7 +29652,6 @@
                 <w:szCs w:val="19"/>
               </w:rPr>
             </w:pPr>
-            <w:proofErr w:type="spellStart"/>
             <w:r>
               <w:rPr>
                 <w:rFonts w:asciiTheme="minorHAnsi" w:hAnsiTheme="minorHAnsi" w:cstheme="minorHAnsi"/>
@@ -29889,7 +29661,6 @@
               </w:rPr>
               <w:t>RentAmount</w:t>
             </w:r>
-            <w:proofErr w:type="spellEnd"/>
           </w:p>
         </w:tc>
         <w:tc>
@@ -30008,7 +29779,6 @@
                 <w:szCs w:val="19"/>
               </w:rPr>
             </w:pPr>
-            <w:proofErr w:type="spellStart"/>
             <w:r>
               <w:rPr>
                 <w:rFonts w:asciiTheme="minorHAnsi" w:hAnsiTheme="minorHAnsi" w:cstheme="minorHAnsi"/>
@@ -30018,7 +29788,6 @@
               </w:rPr>
               <w:t>EffectiveDate</w:t>
             </w:r>
-            <w:proofErr w:type="spellEnd"/>
           </w:p>
         </w:tc>
         <w:tc>
@@ -30127,11 +29896,9 @@
       <w:pPr>
         <w:pStyle w:val="3"/>
       </w:pPr>
-      <w:proofErr w:type="spellStart"/>
       <w:r>
         <w:t>RentPeriod</w:t>
       </w:r>
-      <w:proofErr w:type="spellEnd"/>
     </w:p>
     <w:p>
       <w:pPr>
@@ -30324,7 +30091,6 @@
                 <w:szCs w:val="19"/>
               </w:rPr>
             </w:pPr>
-            <w:proofErr w:type="spellStart"/>
             <w:r>
               <w:rPr>
                 <w:rFonts w:asciiTheme="minorHAnsi" w:hAnsiTheme="minorHAnsi" w:cstheme="minorHAnsi"/>
@@ -30334,7 +30100,6 @@
               </w:rPr>
               <w:t>PeriodID</w:t>
             </w:r>
-            <w:proofErr w:type="spellEnd"/>
           </w:p>
         </w:tc>
         <w:tc>
@@ -30453,7 +30218,6 @@
                 <w:szCs w:val="19"/>
               </w:rPr>
             </w:pPr>
-            <w:proofErr w:type="spellStart"/>
             <w:r>
               <w:rPr>
                 <w:rFonts w:asciiTheme="minorHAnsi" w:hAnsiTheme="minorHAnsi" w:cstheme="minorHAnsi"/>
@@ -30463,7 +30227,6 @@
               </w:rPr>
               <w:t>PeriodMonth</w:t>
             </w:r>
-            <w:proofErr w:type="spellEnd"/>
           </w:p>
         </w:tc>
         <w:tc>
@@ -30582,7 +30345,6 @@
                 <w:szCs w:val="19"/>
               </w:rPr>
             </w:pPr>
-            <w:proofErr w:type="spellStart"/>
             <w:r>
               <w:rPr>
                 <w:rFonts w:asciiTheme="minorHAnsi" w:hAnsiTheme="minorHAnsi" w:cstheme="minorHAnsi"/>
@@ -30592,7 +30354,6 @@
               </w:rPr>
               <w:t>PeriodYear</w:t>
             </w:r>
-            <w:proofErr w:type="spellEnd"/>
           </w:p>
         </w:tc>
         <w:tc>
@@ -30711,7 +30472,6 @@
                 <w:szCs w:val="19"/>
               </w:rPr>
             </w:pPr>
-            <w:proofErr w:type="spellStart"/>
             <w:r>
               <w:rPr>
                 <w:rFonts w:asciiTheme="minorHAnsi" w:hAnsiTheme="minorHAnsi" w:cstheme="minorHAnsi"/>
@@ -30721,7 +30481,6 @@
               </w:rPr>
               <w:t>DueDate</w:t>
             </w:r>
-            <w:proofErr w:type="spellEnd"/>
           </w:p>
         </w:tc>
         <w:tc>
@@ -30835,13 +30594,11 @@
       <w:pPr>
         <w:pStyle w:val="3"/>
       </w:pPr>
-      <w:proofErr w:type="spellStart"/>
       <w:r>
         <w:t>PaymentRecords</w:t>
       </w:r>
       <w:bookmarkEnd w:id="69"/>
       <w:bookmarkEnd w:id="70"/>
-      <w:proofErr w:type="spellEnd"/>
     </w:p>
     <w:tbl>
       <w:tblPr>
@@ -31050,7 +30807,6 @@
                 <w:rFonts w:asciiTheme="minorHAnsi" w:hAnsiTheme="minorHAnsi" w:cstheme="minorHAnsi"/>
               </w:rPr>
             </w:pPr>
-            <w:proofErr w:type="spellStart"/>
             <w:r>
               <w:rPr>
                 <w:rFonts w:asciiTheme="minorHAnsi" w:hAnsiTheme="minorHAnsi" w:cstheme="minorHAnsi"/>
@@ -31060,7 +30816,6 @@
               </w:rPr>
               <w:t>PaymentID</w:t>
             </w:r>
-            <w:proofErr w:type="spellEnd"/>
           </w:p>
         </w:tc>
         <w:tc>
@@ -31200,7 +30955,6 @@
                 <w:rFonts w:asciiTheme="minorHAnsi" w:hAnsiTheme="minorHAnsi" w:cstheme="minorHAnsi"/>
               </w:rPr>
             </w:pPr>
-            <w:proofErr w:type="spellStart"/>
             <w:r>
               <w:rPr>
                 <w:rFonts w:asciiTheme="minorHAnsi" w:hAnsiTheme="minorHAnsi" w:cstheme="minorHAnsi"/>
@@ -31210,7 +30964,6 @@
               </w:rPr>
               <w:t>TenantID</w:t>
             </w:r>
-            <w:proofErr w:type="spellEnd"/>
           </w:p>
         </w:tc>
         <w:tc>
@@ -31341,7 +31094,6 @@
                 <w:rFonts w:asciiTheme="minorHAnsi" w:hAnsiTheme="minorHAnsi" w:cstheme="minorHAnsi"/>
               </w:rPr>
             </w:pPr>
-            <w:proofErr w:type="spellStart"/>
             <w:r>
               <w:rPr>
                 <w:rFonts w:asciiTheme="minorHAnsi" w:hAnsiTheme="minorHAnsi" w:cstheme="minorHAnsi"/>
@@ -31352,7 +31104,6 @@
               <w:lastRenderedPageBreak/>
               <w:t>ApartmentID</w:t>
             </w:r>
-            <w:proofErr w:type="spellEnd"/>
           </w:p>
         </w:tc>
         <w:tc>
@@ -31483,7 +31234,6 @@
                 <w:rFonts w:asciiTheme="minorHAnsi" w:hAnsiTheme="minorHAnsi" w:cstheme="minorHAnsi"/>
               </w:rPr>
             </w:pPr>
-            <w:proofErr w:type="spellStart"/>
             <w:r>
               <w:rPr>
                 <w:rFonts w:asciiTheme="minorHAnsi" w:hAnsiTheme="minorHAnsi" w:cstheme="minorHAnsi"/>
@@ -31499,7 +31249,6 @@
               </w:rPr>
               <w:t>Paid</w:t>
             </w:r>
-            <w:proofErr w:type="spellEnd"/>
           </w:p>
         </w:tc>
         <w:tc>
@@ -31630,7 +31379,6 @@
                 <w:rFonts w:asciiTheme="minorHAnsi" w:hAnsiTheme="minorHAnsi" w:cstheme="minorHAnsi"/>
               </w:rPr>
             </w:pPr>
-            <w:proofErr w:type="spellStart"/>
             <w:r>
               <w:rPr>
                 <w:rFonts w:asciiTheme="minorHAnsi" w:hAnsiTheme="minorHAnsi" w:cstheme="minorHAnsi"/>
@@ -31640,7 +31388,6 @@
               </w:rPr>
               <w:t>PaymentDate</w:t>
             </w:r>
-            <w:proofErr w:type="spellEnd"/>
           </w:p>
         </w:tc>
         <w:tc>
@@ -31771,7 +31518,6 @@
                 <w:rFonts w:asciiTheme="minorHAnsi" w:hAnsiTheme="minorHAnsi" w:cstheme="minorHAnsi"/>
               </w:rPr>
             </w:pPr>
-            <w:proofErr w:type="spellStart"/>
             <w:r>
               <w:rPr>
                 <w:rFonts w:asciiTheme="minorHAnsi" w:hAnsiTheme="minorHAnsi" w:cstheme="minorHAnsi"/>
@@ -31781,7 +31527,6 @@
               </w:rPr>
               <w:t>PeriodID</w:t>
             </w:r>
-            <w:proofErr w:type="spellEnd"/>
           </w:p>
         </w:tc>
         <w:tc>
@@ -31912,7 +31657,6 @@
                 <w:rFonts w:asciiTheme="minorHAnsi" w:hAnsiTheme="minorHAnsi" w:cstheme="minorHAnsi"/>
               </w:rPr>
             </w:pPr>
-            <w:proofErr w:type="spellStart"/>
             <w:r>
               <w:rPr>
                 <w:rFonts w:asciiTheme="minorHAnsi" w:hAnsiTheme="minorHAnsi" w:cstheme="minorHAnsi"/>
@@ -31931,7 +31675,6 @@
               </w:rPr>
               <w:t>Method</w:t>
             </w:r>
-            <w:proofErr w:type="spellEnd"/>
           </w:p>
         </w:tc>
         <w:tc>
@@ -32210,7 +31953,6 @@
                 <w:rFonts w:asciiTheme="minorHAnsi" w:hAnsiTheme="minorHAnsi" w:cstheme="minorHAnsi"/>
               </w:rPr>
             </w:pPr>
-            <w:proofErr w:type="spellStart"/>
             <w:r>
               <w:rPr>
                 <w:rFonts w:asciiTheme="minorHAnsi" w:hAnsiTheme="minorHAnsi" w:cstheme="minorHAnsi"/>
@@ -32220,7 +31962,6 @@
               </w:rPr>
               <w:t>CorrectionNote</w:t>
             </w:r>
-            <w:proofErr w:type="spellEnd"/>
           </w:p>
         </w:tc>
         <w:tc>
@@ -32552,7 +32293,6 @@
                 <w:rFonts w:asciiTheme="minorHAnsi" w:hAnsiTheme="minorHAnsi" w:cstheme="minorHAnsi"/>
               </w:rPr>
             </w:pPr>
-            <w:proofErr w:type="spellStart"/>
             <w:r>
               <w:rPr>
                 <w:rFonts w:asciiTheme="minorHAnsi" w:hAnsiTheme="minorHAnsi" w:cstheme="minorHAnsi"/>
@@ -32562,7 +32302,6 @@
               </w:rPr>
               <w:t>IssueID</w:t>
             </w:r>
-            <w:proofErr w:type="spellEnd"/>
           </w:p>
         </w:tc>
         <w:tc>
@@ -32586,25 +32325,7 @@
                 <w:sz w:val="19"/>
                 <w:szCs w:val="19"/>
               </w:rPr>
-              <w:t xml:space="preserve">Unique </w:t>
-            </w:r>
-            <w:r>
-              <w:rPr>
-                <w:rFonts w:asciiTheme="minorHAnsi" w:hAnsiTheme="minorHAnsi" w:cstheme="minorHAnsi"/>
-                <w:color w:val="000000"/>
-                <w:sz w:val="19"/>
-                <w:szCs w:val="19"/>
-              </w:rPr>
-              <w:t xml:space="preserve">Issue </w:t>
-            </w:r>
-            <w:r>
-              <w:rPr>
-                <w:rFonts w:asciiTheme="minorHAnsi" w:hAnsiTheme="minorHAnsi" w:cstheme="minorHAnsi"/>
-                <w:color w:val="000000"/>
-                <w:sz w:val="19"/>
-                <w:szCs w:val="19"/>
-              </w:rPr>
-              <w:t>identifier</w:t>
+              <w:t>Unique Issue identifier</w:t>
             </w:r>
           </w:p>
         </w:tc>
@@ -32711,7 +32432,6 @@
                 <w:rFonts w:asciiTheme="minorHAnsi" w:hAnsiTheme="minorHAnsi" w:cstheme="minorHAnsi"/>
               </w:rPr>
             </w:pPr>
-            <w:proofErr w:type="spellStart"/>
             <w:r>
               <w:rPr>
                 <w:rFonts w:asciiTheme="minorHAnsi" w:hAnsiTheme="minorHAnsi" w:cstheme="minorHAnsi"/>
@@ -32721,7 +32441,6 @@
               </w:rPr>
               <w:t>ApartmentID</w:t>
             </w:r>
-            <w:proofErr w:type="spellEnd"/>
           </w:p>
         </w:tc>
         <w:tc>
@@ -32852,7 +32571,6 @@
                 <w:rFonts w:asciiTheme="minorHAnsi" w:hAnsiTheme="minorHAnsi" w:cstheme="minorHAnsi"/>
               </w:rPr>
             </w:pPr>
-            <w:proofErr w:type="spellStart"/>
             <w:r>
               <w:rPr>
                 <w:rFonts w:asciiTheme="minorHAnsi" w:hAnsiTheme="minorHAnsi" w:cstheme="minorHAnsi"/>
@@ -32862,7 +32580,6 @@
               </w:rPr>
               <w:t>TenantID</w:t>
             </w:r>
-            <w:proofErr w:type="spellEnd"/>
           </w:p>
         </w:tc>
         <w:tc>
@@ -33419,7 +33136,6 @@
                 <w:rFonts w:asciiTheme="minorHAnsi" w:hAnsiTheme="minorHAnsi" w:cstheme="minorHAnsi"/>
               </w:rPr>
             </w:pPr>
-            <w:proofErr w:type="spellStart"/>
             <w:r>
               <w:rPr>
                 <w:rFonts w:asciiTheme="minorHAnsi" w:hAnsiTheme="minorHAnsi" w:cstheme="minorHAnsi"/>
@@ -33429,7 +33145,6 @@
               </w:rPr>
               <w:t>CreatedAt</w:t>
             </w:r>
-            <w:proofErr w:type="spellEnd"/>
           </w:p>
         </w:tc>
         <w:tc>
@@ -33560,7 +33275,6 @@
                 <w:rFonts w:asciiTheme="minorHAnsi" w:hAnsiTheme="minorHAnsi" w:cstheme="minorHAnsi"/>
               </w:rPr>
             </w:pPr>
-            <w:proofErr w:type="spellStart"/>
             <w:r>
               <w:rPr>
                 <w:rFonts w:asciiTheme="minorHAnsi" w:hAnsiTheme="minorHAnsi" w:cstheme="minorHAnsi"/>
@@ -33570,7 +33284,6 @@
               </w:rPr>
               <w:t>ResolvedAt</w:t>
             </w:r>
-            <w:proofErr w:type="spellEnd"/>
           </w:p>
         </w:tc>
         <w:tc>
@@ -33594,16 +33307,7 @@
                 <w:sz w:val="19"/>
                 <w:szCs w:val="19"/>
               </w:rPr>
-              <w:t xml:space="preserve">The date the issue was </w:t>
-            </w:r>
-            <w:r>
-              <w:rPr>
-                <w:rFonts w:asciiTheme="minorHAnsi" w:hAnsiTheme="minorHAnsi" w:cstheme="minorHAnsi"/>
-                <w:color w:val="000000"/>
-                <w:sz w:val="19"/>
-                <w:szCs w:val="19"/>
-              </w:rPr>
-              <w:t>resolved</w:t>
+              <w:t>The date the issue was resolved</w:t>
             </w:r>
           </w:p>
         </w:tc>
@@ -33710,7 +33414,6 @@
                 <w:rFonts w:asciiTheme="minorHAnsi" w:hAnsiTheme="minorHAnsi" w:cstheme="minorHAnsi"/>
               </w:rPr>
             </w:pPr>
-            <w:proofErr w:type="spellStart"/>
             <w:r>
               <w:rPr>
                 <w:rFonts w:asciiTheme="minorHAnsi" w:hAnsiTheme="minorHAnsi" w:cstheme="minorHAnsi"/>
@@ -33720,7 +33423,6 @@
               </w:rPr>
               <w:t>ResolutionNotes</w:t>
             </w:r>
-            <w:proofErr w:type="spellEnd"/>
           </w:p>
         </w:tc>
         <w:tc>
@@ -34074,7 +33776,6 @@
                 <w:szCs w:val="19"/>
               </w:rPr>
             </w:pPr>
-            <w:proofErr w:type="spellStart"/>
             <w:r>
               <w:rPr>
                 <w:rFonts w:asciiTheme="minorHAnsi" w:hAnsiTheme="minorHAnsi" w:cstheme="minorHAnsi"/>
@@ -34084,7 +33785,6 @@
               </w:rPr>
               <w:t>PackageID</w:t>
             </w:r>
-            <w:proofErr w:type="spellEnd"/>
           </w:p>
         </w:tc>
         <w:tc>
@@ -34108,25 +33808,7 @@
                 <w:sz w:val="19"/>
                 <w:szCs w:val="19"/>
               </w:rPr>
-              <w:t xml:space="preserve">Unique </w:t>
-            </w:r>
-            <w:r>
-              <w:rPr>
-                <w:rFonts w:asciiTheme="minorHAnsi" w:hAnsiTheme="minorHAnsi" w:cstheme="minorHAnsi"/>
-                <w:color w:val="000000"/>
-                <w:sz w:val="19"/>
-                <w:szCs w:val="19"/>
-              </w:rPr>
-              <w:t>Package</w:t>
-            </w:r>
-            <w:r>
-              <w:rPr>
-                <w:rFonts w:asciiTheme="minorHAnsi" w:hAnsiTheme="minorHAnsi" w:cstheme="minorHAnsi"/>
-                <w:color w:val="000000"/>
-                <w:sz w:val="19"/>
-                <w:szCs w:val="19"/>
-              </w:rPr>
-              <w:t xml:space="preserve"> identifier</w:t>
+              <w:t>Unique Package identifier</w:t>
             </w:r>
           </w:p>
         </w:tc>
@@ -34239,7 +33921,6 @@
                 <w:szCs w:val="19"/>
               </w:rPr>
             </w:pPr>
-            <w:proofErr w:type="spellStart"/>
             <w:r>
               <w:rPr>
                 <w:rFonts w:asciiTheme="minorHAnsi" w:hAnsiTheme="minorHAnsi" w:cstheme="minorHAnsi"/>
@@ -34249,7 +33930,6 @@
               </w:rPr>
               <w:t>TenantID</w:t>
             </w:r>
-            <w:proofErr w:type="spellEnd"/>
           </w:p>
         </w:tc>
         <w:tc>
@@ -34386,7 +34066,6 @@
                 <w:szCs w:val="19"/>
               </w:rPr>
             </w:pPr>
-            <w:proofErr w:type="spellStart"/>
             <w:r>
               <w:rPr>
                 <w:rFonts w:asciiTheme="minorHAnsi" w:hAnsiTheme="minorHAnsi" w:cstheme="minorHAnsi"/>
@@ -34404,7 +34083,6 @@
               </w:rPr>
               <w:t>Name</w:t>
             </w:r>
-            <w:proofErr w:type="spellEnd"/>
           </w:p>
         </w:tc>
         <w:tc>
@@ -34541,7 +34219,6 @@
                 <w:szCs w:val="19"/>
               </w:rPr>
             </w:pPr>
-            <w:proofErr w:type="spellStart"/>
             <w:r>
               <w:rPr>
                 <w:rFonts w:asciiTheme="minorHAnsi" w:hAnsiTheme="minorHAnsi" w:cstheme="minorHAnsi"/>
@@ -34551,7 +34228,6 @@
               </w:rPr>
               <w:t>ReceivedDate</w:t>
             </w:r>
-            <w:proofErr w:type="spellEnd"/>
           </w:p>
         </w:tc>
         <w:tc>
@@ -34688,7 +34364,6 @@
                 <w:szCs w:val="19"/>
               </w:rPr>
             </w:pPr>
-            <w:proofErr w:type="spellStart"/>
             <w:r>
               <w:rPr>
                 <w:rFonts w:asciiTheme="minorHAnsi" w:hAnsiTheme="minorHAnsi" w:cstheme="minorHAnsi"/>
@@ -34698,7 +34373,6 @@
               </w:rPr>
               <w:t>StorageLocation</w:t>
             </w:r>
-            <w:proofErr w:type="spellEnd"/>
           </w:p>
         </w:tc>
         <w:tc>
@@ -34980,7 +34654,6 @@
                 <w:szCs w:val="19"/>
               </w:rPr>
             </w:pPr>
-            <w:proofErr w:type="spellStart"/>
             <w:r>
               <w:rPr>
                 <w:rFonts w:asciiTheme="minorHAnsi" w:hAnsiTheme="minorHAnsi" w:cstheme="minorHAnsi"/>
@@ -34990,7 +34663,6 @@
               </w:rPr>
               <w:t>PickupDate</w:t>
             </w:r>
-            <w:proofErr w:type="spellEnd"/>
           </w:p>
         </w:tc>
         <w:tc>
@@ -35127,7 +34799,6 @@
                 <w:szCs w:val="19"/>
               </w:rPr>
             </w:pPr>
-            <w:proofErr w:type="spellStart"/>
             <w:r>
               <w:rPr>
                 <w:rFonts w:asciiTheme="minorHAnsi" w:hAnsiTheme="minorHAnsi" w:cstheme="minorHAnsi"/>
@@ -35137,7 +34808,6 @@
               </w:rPr>
               <w:t>ReceiverConfirmation</w:t>
             </w:r>
-            <w:proofErr w:type="spellEnd"/>
           </w:p>
         </w:tc>
         <w:tc>
@@ -35161,19 +34831,8 @@
                 <w:sz w:val="19"/>
                 <w:szCs w:val="19"/>
               </w:rPr>
-              <w:t xml:space="preserve">The confirmation from the </w:t>
-            </w:r>
-            <w:proofErr w:type="spellStart"/>
-            <w:r>
-              <w:rPr>
-                <w:rFonts w:asciiTheme="minorHAnsi" w:hAnsiTheme="minorHAnsi" w:cstheme="minorHAnsi"/>
-                <w:color w:val="000000"/>
-                <w:sz w:val="19"/>
-                <w:szCs w:val="19"/>
-              </w:rPr>
-              <w:t>teant</w:t>
-            </w:r>
-            <w:proofErr w:type="spellEnd"/>
+              <w:t>The confirmation from the teant</w:t>
+            </w:r>
           </w:p>
         </w:tc>
         <w:tc>
@@ -35485,7 +35144,6 @@
                 <w:rFonts w:asciiTheme="minorHAnsi" w:hAnsiTheme="minorHAnsi" w:cstheme="minorHAnsi"/>
               </w:rPr>
             </w:pPr>
-            <w:proofErr w:type="spellStart"/>
             <w:r>
               <w:rPr>
                 <w:rFonts w:asciiTheme="minorHAnsi" w:hAnsiTheme="minorHAnsi" w:cstheme="minorHAnsi"/>
@@ -35495,7 +35153,6 @@
               </w:rPr>
               <w:t>UserID</w:t>
             </w:r>
-            <w:proofErr w:type="spellEnd"/>
           </w:p>
         </w:tc>
         <w:tc>
@@ -35519,25 +35176,7 @@
                 <w:sz w:val="19"/>
                 <w:szCs w:val="19"/>
               </w:rPr>
-              <w:t xml:space="preserve">Unique </w:t>
-            </w:r>
-            <w:r>
-              <w:rPr>
-                <w:rFonts w:asciiTheme="minorHAnsi" w:hAnsiTheme="minorHAnsi" w:cstheme="minorHAnsi"/>
-                <w:color w:val="000000"/>
-                <w:sz w:val="19"/>
-                <w:szCs w:val="19"/>
-              </w:rPr>
-              <w:t>User</w:t>
-            </w:r>
-            <w:r>
-              <w:rPr>
-                <w:rFonts w:asciiTheme="minorHAnsi" w:hAnsiTheme="minorHAnsi" w:cstheme="minorHAnsi"/>
-                <w:color w:val="000000"/>
-                <w:sz w:val="19"/>
-                <w:szCs w:val="19"/>
-              </w:rPr>
-              <w:t xml:space="preserve"> identifier</w:t>
+              <w:t>Unique User identifier</w:t>
             </w:r>
           </w:p>
         </w:tc>
@@ -35778,7 +35417,6 @@
                 <w:rFonts w:asciiTheme="minorHAnsi" w:hAnsiTheme="minorHAnsi" w:cstheme="minorHAnsi"/>
               </w:rPr>
             </w:pPr>
-            <w:proofErr w:type="spellStart"/>
             <w:r>
               <w:rPr>
                 <w:rFonts w:asciiTheme="minorHAnsi" w:hAnsiTheme="minorHAnsi" w:cstheme="minorHAnsi"/>
@@ -35788,7 +35426,6 @@
               </w:rPr>
               <w:t>PasswordHash</w:t>
             </w:r>
-            <w:proofErr w:type="spellEnd"/>
           </w:p>
         </w:tc>
         <w:tc>
@@ -35919,7 +35556,6 @@
                 <w:rFonts w:asciiTheme="minorHAnsi" w:hAnsiTheme="minorHAnsi" w:cstheme="minorHAnsi"/>
               </w:rPr>
             </w:pPr>
-            <w:proofErr w:type="spellStart"/>
             <w:r>
               <w:rPr>
                 <w:rFonts w:asciiTheme="minorHAnsi" w:hAnsiTheme="minorHAnsi" w:cstheme="minorHAnsi"/>
@@ -35929,7 +35565,6 @@
               </w:rPr>
               <w:t>FullName</w:t>
             </w:r>
-            <w:proofErr w:type="spellEnd"/>
           </w:p>
         </w:tc>
         <w:tc>
@@ -36060,7 +35695,6 @@
                 <w:rFonts w:asciiTheme="minorHAnsi" w:hAnsiTheme="minorHAnsi" w:cstheme="minorHAnsi"/>
               </w:rPr>
             </w:pPr>
-            <w:proofErr w:type="spellStart"/>
             <w:r>
               <w:rPr>
                 <w:rFonts w:asciiTheme="minorHAnsi" w:hAnsiTheme="minorHAnsi" w:cstheme="minorHAnsi"/>
@@ -36070,7 +35704,6 @@
               </w:rPr>
               <w:t>RoleID</w:t>
             </w:r>
-            <w:proofErr w:type="spellEnd"/>
           </w:p>
         </w:tc>
         <w:tc>
@@ -36201,7 +35834,6 @@
                 <w:rFonts w:asciiTheme="minorHAnsi" w:hAnsiTheme="minorHAnsi" w:cstheme="minorHAnsi"/>
               </w:rPr>
             </w:pPr>
-            <w:proofErr w:type="spellStart"/>
             <w:r>
               <w:rPr>
                 <w:rFonts w:asciiTheme="minorHAnsi" w:hAnsiTheme="minorHAnsi" w:cstheme="minorHAnsi"/>
@@ -36211,7 +35843,6 @@
               </w:rPr>
               <w:t>IsActive</w:t>
             </w:r>
-            <w:proofErr w:type="spellEnd"/>
           </w:p>
         </w:tc>
         <w:tc>
@@ -36543,7 +36174,6 @@
                 <w:rFonts w:asciiTheme="minorHAnsi" w:hAnsiTheme="minorHAnsi" w:cstheme="minorHAnsi"/>
               </w:rPr>
             </w:pPr>
-            <w:proofErr w:type="spellStart"/>
             <w:r>
               <w:rPr>
                 <w:rFonts w:asciiTheme="minorHAnsi" w:hAnsiTheme="minorHAnsi" w:cstheme="minorHAnsi"/>
@@ -36553,7 +36183,6 @@
               </w:rPr>
               <w:t>RoleID</w:t>
             </w:r>
-            <w:proofErr w:type="spellEnd"/>
           </w:p>
         </w:tc>
         <w:tc>
@@ -36577,25 +36206,7 @@
                 <w:sz w:val="19"/>
                 <w:szCs w:val="19"/>
               </w:rPr>
-              <w:t xml:space="preserve">Unique </w:t>
-            </w:r>
-            <w:r>
-              <w:rPr>
-                <w:rFonts w:asciiTheme="minorHAnsi" w:hAnsiTheme="minorHAnsi" w:cstheme="minorHAnsi"/>
-                <w:color w:val="000000"/>
-                <w:sz w:val="19"/>
-                <w:szCs w:val="19"/>
-              </w:rPr>
-              <w:t>Role</w:t>
-            </w:r>
-            <w:r>
-              <w:rPr>
-                <w:rFonts w:asciiTheme="minorHAnsi" w:hAnsiTheme="minorHAnsi" w:cstheme="minorHAnsi"/>
-                <w:color w:val="000000"/>
-                <w:sz w:val="19"/>
-                <w:szCs w:val="19"/>
-              </w:rPr>
-              <w:t xml:space="preserve"> identifier</w:t>
+              <w:t>Unique Role identifier</w:t>
             </w:r>
           </w:p>
         </w:tc>
@@ -36702,7 +36313,6 @@
                 <w:rFonts w:asciiTheme="minorHAnsi" w:hAnsiTheme="minorHAnsi" w:cstheme="minorHAnsi"/>
               </w:rPr>
             </w:pPr>
-            <w:proofErr w:type="spellStart"/>
             <w:r>
               <w:rPr>
                 <w:rFonts w:asciiTheme="minorHAnsi" w:hAnsiTheme="minorHAnsi" w:cstheme="minorHAnsi"/>
@@ -36712,7 +36322,6 @@
               </w:rPr>
               <w:t>RoleName</w:t>
             </w:r>
-            <w:proofErr w:type="spellEnd"/>
           </w:p>
         </w:tc>
         <w:tc>
@@ -36900,10 +36509,10 @@
         </w:rPr>
         <w:lastRenderedPageBreak/>
         <w:drawing>
-          <wp:inline distT="0" distB="0" distL="0" distR="0" wp14:anchorId="2F1AEB2C" wp14:editId="36BCB061">
-            <wp:extent cx="4000500" cy="5536640"/>
-            <wp:effectExtent l="0" t="0" r="0" b="0"/>
-            <wp:docPr id="1" name="صورة 1"/>
+          <wp:inline distT="0" distB="0" distL="0" distR="0" wp14:anchorId="04E39D4A" wp14:editId="65B6565A">
+            <wp:extent cx="5820410" cy="7974965"/>
+            <wp:effectExtent l="0" t="0" r="8890" b="6985"/>
+            <wp:docPr id="10" name="صورة 10"/>
             <wp:cNvGraphicFramePr>
               <a:graphicFrameLocks xmlns:a="http://schemas.openxmlformats.org/drawingml/2006/main" noChangeAspect="1"/>
             </wp:cNvGraphicFramePr>
@@ -36911,13 +36520,19 @@
               <a:graphicData uri="http://schemas.openxmlformats.org/drawingml/2006/picture">
                 <pic:pic xmlns:pic="http://schemas.openxmlformats.org/drawingml/2006/picture">
                   <pic:nvPicPr>
-                    <pic:cNvPr id="0" name=""/>
+                    <pic:cNvPr id="0" name="Picture 1"/>
                     <pic:cNvPicPr>
                       <a:picLocks noChangeAspect="1" noChangeArrowheads="1"/>
                     </pic:cNvPicPr>
                   </pic:nvPicPr>
                   <pic:blipFill>
-                    <a:blip r:embed="rId9"/>
+                    <a:blip r:embed="rId9">
+                      <a:extLst>
+                        <a:ext uri="{28A0092B-C50C-407E-A947-70E740481C1C}">
+                          <a14:useLocalDpi xmlns:a14="http://schemas.microsoft.com/office/drawing/2010/main" val="0"/>
+                        </a:ext>
+                      </a:extLst>
+                    </a:blip>
                     <a:srcRect/>
                     <a:stretch>
                       <a:fillRect/>
@@ -36926,11 +36541,15 @@
                   <pic:spPr bwMode="auto">
                     <a:xfrm>
                       <a:off x="0" y="0"/>
-                      <a:ext cx="4000500" cy="5536640"/>
+                      <a:ext cx="5820410" cy="7974965"/>
                     </a:xfrm>
                     <a:prstGeom prst="rect">
                       <a:avLst/>
                     </a:prstGeom>
+                    <a:noFill/>
+                    <a:ln>
+                      <a:noFill/>
+                    </a:ln>
                   </pic:spPr>
                 </pic:pic>
               </a:graphicData>
@@ -36965,6 +36584,7 @@
       <w:bookmarkStart w:id="84" w:name="_Toc240648826"/>
       <w:bookmarkStart w:id="85" w:name="_Toc240648940"/>
       <w:r>
+        <w:lastRenderedPageBreak/>
         <w:t>Process Flow / Activity Diagram</w:t>
       </w:r>
       <w:bookmarkEnd w:id="84"/>
@@ -36998,7 +36618,6 @@
           <w:rFonts w:asciiTheme="minorHAnsi" w:hAnsiTheme="minorHAnsi" w:cstheme="minorHAnsi"/>
           <w:noProof/>
         </w:rPr>
-        <w:lastRenderedPageBreak/>
         <w:drawing>
           <wp:inline distT="0" distB="0" distL="0" distR="0" wp14:anchorId="7FC75852" wp14:editId="1D942EE3">
             <wp:extent cx="3238500" cy="6481848"/>
@@ -37111,1300 +36730,54 @@
           <w:noProof/>
         </w:rPr>
         <w:lastRenderedPageBreak/>
-        <mc:AlternateContent>
-          <mc:Choice Requires="wps">
-            <w:drawing>
-              <wp:anchor distT="0" distB="0" distL="114300" distR="114300" simplePos="0" relativeHeight="251665408" behindDoc="0" locked="0" layoutInCell="1" allowOverlap="1" wp14:anchorId="3A8B1D35" wp14:editId="3241714E">
-                <wp:simplePos x="0" y="0"/>
-                <wp:positionH relativeFrom="column">
-                  <wp:posOffset>5337442</wp:posOffset>
-                </wp:positionH>
-                <wp:positionV relativeFrom="paragraph">
-                  <wp:posOffset>678054</wp:posOffset>
-                </wp:positionV>
-                <wp:extent cx="183314" cy="196382"/>
-                <wp:effectExtent l="0" t="0" r="26670" b="13335"/>
-                <wp:wrapNone/>
-                <wp:docPr id="12" name="مخطط انسيابي: رابط 12"/>
-                <wp:cNvGraphicFramePr/>
-                <a:graphic xmlns:a="http://schemas.openxmlformats.org/drawingml/2006/main">
-                  <a:graphicData uri="http://schemas.microsoft.com/office/word/2010/wordprocessingShape">
-                    <wps:wsp>
-                      <wps:cNvSpPr/>
-                      <wps:spPr>
-                        <a:xfrm>
-                          <a:off x="0" y="0"/>
-                          <a:ext cx="183314" cy="196382"/>
-                        </a:xfrm>
-                        <a:prstGeom prst="flowChartConnector">
-                          <a:avLst/>
-                        </a:prstGeom>
-                        <a:noFill/>
-                        <a:ln>
-                          <a:solidFill>
-                            <a:schemeClr val="bg1"/>
-                          </a:solidFill>
-                        </a:ln>
-                      </wps:spPr>
-                      <wps:style>
-                        <a:lnRef idx="2">
-                          <a:schemeClr val="accent1">
-                            <a:shade val="50000"/>
-                          </a:schemeClr>
-                        </a:lnRef>
-                        <a:fillRef idx="1">
-                          <a:schemeClr val="accent1"/>
-                        </a:fillRef>
-                        <a:effectRef idx="0">
-                          <a:schemeClr val="accent1"/>
-                        </a:effectRef>
-                        <a:fontRef idx="minor">
-                          <a:schemeClr val="lt1"/>
-                        </a:fontRef>
-                      </wps:style>
-                      <wps:txbx>
-                        <w:txbxContent>
-                          <w:tbl>
-                            <w:tblPr>
-                              <w:tblW w:w="8800" w:type="dxa"/>
-                              <w:tblBorders>
-                                <w:top w:val="single" w:sz="4" w:space="0" w:color="auto"/>
-                                <w:left w:val="single" w:sz="4" w:space="0" w:color="auto"/>
-                                <w:bottom w:val="single" w:sz="4" w:space="0" w:color="auto"/>
-                                <w:right w:val="single" w:sz="4" w:space="0" w:color="auto"/>
-                                <w:insideH w:val="single" w:sz="4" w:space="0" w:color="auto"/>
-                                <w:insideV w:val="single" w:sz="4" w:space="0" w:color="auto"/>
-                              </w:tblBorders>
-                              <w:tblCellMar>
-                                <w:left w:w="10" w:type="dxa"/>
-                                <w:right w:w="10" w:type="dxa"/>
-                              </w:tblCellMar>
-                              <w:tblLook w:val="04A0" w:firstRow="1" w:lastRow="0" w:firstColumn="1" w:lastColumn="0" w:noHBand="0" w:noVBand="1"/>
-                            </w:tblPr>
-                            <w:tblGrid>
-                              <w:gridCol w:w="4400"/>
-                              <w:gridCol w:w="4400"/>
-                            </w:tblGrid>
-                            <w:tr>
-                              <w:tc>
-                                <w:tcPr>
-                                  <w:tcW w:w="4400" w:type="dxa"/>
-                                  <w:tcBorders>
-                                    <w:top w:val="single" w:sz="4" w:space="0" w:color="auto"/>
-                                    <w:left w:val="single" w:sz="4" w:space="0" w:color="auto"/>
-                                    <w:bottom w:val="single" w:sz="4" w:space="0" w:color="auto"/>
-                                    <w:right w:val="single" w:sz="4" w:space="0" w:color="auto"/>
-                                  </w:tcBorders>
-                                  <w:shd w:val="clear" w:color="auto" w:fill="1F4E78"/>
-                                  <w:hideMark/>
-                                </w:tcPr>
-                                <w:p>
-                                  <w:r>
-                                    <w:rPr>
-                                      <w:b/>
-                                      <w:bCs/>
-                                      <w:color w:val="FFFFFF"/>
-                                    </w:rPr>
-                                    <w:t>In Scope</w:t>
-                                  </w:r>
-                                </w:p>
-                              </w:tc>
-                              <w:tc>
-                                <w:tcPr>
-                                  <w:tcW w:w="4400" w:type="dxa"/>
-                                  <w:tcBorders>
-                                    <w:top w:val="single" w:sz="4" w:space="0" w:color="auto"/>
-                                    <w:left w:val="single" w:sz="4" w:space="0" w:color="auto"/>
-                                    <w:bottom w:val="single" w:sz="4" w:space="0" w:color="auto"/>
-                                    <w:right w:val="single" w:sz="4" w:space="0" w:color="auto"/>
-                                  </w:tcBorders>
-                                  <w:shd w:val="clear" w:color="auto" w:fill="1F4E78"/>
-                                  <w:hideMark/>
-                                </w:tcPr>
-                                <w:p>
-                                  <w:r>
-                                    <w:rPr>
-                                      <w:b/>
-                                      <w:bCs/>
-                                      <w:color w:val="FFFFFF"/>
-                                    </w:rPr>
-                                    <w:t>Out of Scope</w:t>
-                                  </w:r>
-                                </w:p>
-                              </w:tc>
-                            </w:tr>
-                            <w:tr>
-                              <w:tc>
-                                <w:tcPr>
-                                  <w:tcW w:w="4400" w:type="dxa"/>
-                                  <w:tcBorders>
-                                    <w:top w:val="single" w:sz="4" w:space="0" w:color="auto"/>
-                                    <w:left w:val="single" w:sz="4" w:space="0" w:color="auto"/>
-                                    <w:bottom w:val="single" w:sz="4" w:space="0" w:color="auto"/>
-                                    <w:right w:val="single" w:sz="4" w:space="0" w:color="auto"/>
-                                  </w:tcBorders>
-                                  <w:hideMark/>
-                                </w:tcPr>
-                                <w:p>
-                                  <w:r>
-                                    <w:rPr>
-                                      <w:color w:val="000000"/>
-                                    </w:rPr>
-                                    <w:t>Apartment &amp; occupancy management (Vacant / Occupied / Maintenance)</w:t>
-                                  </w:r>
-                                </w:p>
-                              </w:tc>
-                              <w:tc>
-                                <w:tcPr>
-                                  <w:tcW w:w="4400" w:type="dxa"/>
-                                  <w:tcBorders>
-                                    <w:top w:val="single" w:sz="4" w:space="0" w:color="auto"/>
-                                    <w:left w:val="single" w:sz="4" w:space="0" w:color="auto"/>
-                                    <w:bottom w:val="single" w:sz="4" w:space="0" w:color="auto"/>
-                                    <w:right w:val="single" w:sz="4" w:space="0" w:color="auto"/>
-                                  </w:tcBorders>
-                                  <w:hideMark/>
-                                </w:tcPr>
-                                <w:p>
-                                  <w:r>
-                                    <w:rPr>
-                                      <w:color w:val="000000"/>
-                                    </w:rPr>
-                                    <w:t>Online payment gateways (</w:t>
-                                  </w:r>
-                                  <w:proofErr w:type="spellStart"/>
-                                  <w:r>
-                                    <w:rPr>
-                                      <w:color w:val="000000"/>
-                                    </w:rPr>
-                                    <w:t>Jaib</w:t>
-                                  </w:r>
-                                  <w:proofErr w:type="spellEnd"/>
-                                  <w:r>
-                                    <w:rPr>
-                                      <w:color w:val="000000"/>
-                                    </w:rPr>
-                                    <w:t xml:space="preserve">, </w:t>
-                                  </w:r>
-                                  <w:proofErr w:type="spellStart"/>
-                                  <w:r>
-                                    <w:rPr>
-                                      <w:color w:val="000000"/>
-                                    </w:rPr>
-                                    <w:t>OneCash</w:t>
-                                  </w:r>
-                                  <w:proofErr w:type="spellEnd"/>
-                                  <w:r>
-                                    <w:rPr>
-                                      <w:color w:val="000000"/>
-                                    </w:rPr>
-                                    <w:t>, Stripe, banking APIs) — CR-001 Rejected</w:t>
-                                  </w:r>
-                                </w:p>
-                              </w:tc>
-                            </w:tr>
-                            <w:tr>
-                              <w:tc>
-                                <w:tcPr>
-                                  <w:tcW w:w="4400" w:type="dxa"/>
-                                  <w:tcBorders>
-                                    <w:top w:val="single" w:sz="4" w:space="0" w:color="auto"/>
-                                    <w:left w:val="single" w:sz="4" w:space="0" w:color="auto"/>
-                                    <w:bottom w:val="single" w:sz="4" w:space="0" w:color="auto"/>
-                                    <w:right w:val="single" w:sz="4" w:space="0" w:color="auto"/>
-                                  </w:tcBorders>
-                                  <w:hideMark/>
-                                </w:tcPr>
-                                <w:p>
-                                  <w:r>
-                                    <w:rPr>
-                                      <w:color w:val="000000"/>
-                                    </w:rPr>
-                                    <w:t>Rent &amp; payment tracking (cash / dockets, overdue balances, receipts)</w:t>
-                                  </w:r>
-                                </w:p>
-                              </w:tc>
-                              <w:tc>
-                                <w:tcPr>
-                                  <w:tcW w:w="4400" w:type="dxa"/>
-                                  <w:tcBorders>
-                                    <w:top w:val="single" w:sz="4" w:space="0" w:color="auto"/>
-                                    <w:left w:val="single" w:sz="4" w:space="0" w:color="auto"/>
-                                    <w:bottom w:val="single" w:sz="4" w:space="0" w:color="auto"/>
-                                    <w:right w:val="single" w:sz="4" w:space="0" w:color="auto"/>
-                                  </w:tcBorders>
-                                  <w:hideMark/>
-                                </w:tcPr>
-                                <w:p>
-                                  <w:r>
-                                    <w:rPr>
-                                      <w:color w:val="000000"/>
-                                    </w:rPr>
-                                    <w:t xml:space="preserve">Cloud </w:t>
-                                  </w:r>
-                                  <w:r>
-                                    <w:rPr>
-                                      <w:color w:val="000000"/>
-                                    </w:rPr>
-                                    <w:t>database (MSSQL Server)</w:t>
-                                  </w:r>
-                                  <w:r>
-                                    <w:rPr>
-                                      <w:color w:val="000000"/>
-                                    </w:rPr>
-                                    <w:t xml:space="preserve"> synchronization and remote APIs</w:t>
-                                  </w:r>
-                                </w:p>
-                              </w:tc>
-                            </w:tr>
-                            <w:tr>
-                              <w:tc>
-                                <w:tcPr>
-                                  <w:tcW w:w="4400" w:type="dxa"/>
-                                  <w:tcBorders>
-                                    <w:top w:val="single" w:sz="4" w:space="0" w:color="auto"/>
-                                    <w:left w:val="single" w:sz="4" w:space="0" w:color="auto"/>
-                                    <w:bottom w:val="single" w:sz="4" w:space="0" w:color="auto"/>
-                                    <w:right w:val="single" w:sz="4" w:space="0" w:color="auto"/>
-                                  </w:tcBorders>
-                                  <w:hideMark/>
-                                </w:tcPr>
-                                <w:p>
-                                  <w:r>
-                                    <w:rPr>
-                                      <w:color w:val="000000"/>
-                                    </w:rPr>
-                                    <w:t>Maintenance &amp; issue logging (Open / In Progress / Resolved)</w:t>
-                                  </w:r>
-                                </w:p>
-                              </w:tc>
-                              <w:tc>
-                                <w:tcPr>
-                                  <w:tcW w:w="4400" w:type="dxa"/>
-                                  <w:tcBorders>
-                                    <w:top w:val="single" w:sz="4" w:space="0" w:color="auto"/>
-                                    <w:left w:val="single" w:sz="4" w:space="0" w:color="auto"/>
-                                    <w:bottom w:val="single" w:sz="4" w:space="0" w:color="auto"/>
-                                    <w:right w:val="single" w:sz="4" w:space="0" w:color="auto"/>
-                                  </w:tcBorders>
-                                  <w:hideMark/>
-                                </w:tcPr>
-                                <w:p>
-                                  <w:r>
-                                    <w:rPr>
-                                      <w:color w:val="000000"/>
-                                    </w:rPr>
-                                    <w:t>Tenant mobile applications (iOS / Android)</w:t>
-                                  </w:r>
-                                </w:p>
-                              </w:tc>
-                            </w:tr>
-                            <w:tr>
-                              <w:tc>
-                                <w:tcPr>
-                                  <w:tcW w:w="4400" w:type="dxa"/>
-                                  <w:tcBorders>
-                                    <w:top w:val="single" w:sz="4" w:space="0" w:color="auto"/>
-                                    <w:left w:val="single" w:sz="4" w:space="0" w:color="auto"/>
-                                    <w:bottom w:val="single" w:sz="4" w:space="0" w:color="auto"/>
-                                    <w:right w:val="single" w:sz="4" w:space="0" w:color="auto"/>
-                                  </w:tcBorders>
-                                  <w:hideMark/>
-                                </w:tcPr>
-                                <w:p>
-                                  <w:r>
-                                    <w:rPr>
-                                      <w:color w:val="000000"/>
-                                    </w:rPr>
-                                    <w:t>Package &amp; parcel receiving and pickup tracking</w:t>
-                                  </w:r>
-                                </w:p>
-                              </w:tc>
-                              <w:tc>
-                                <w:tcPr>
-                                  <w:tcW w:w="4400" w:type="dxa"/>
-                                  <w:tcBorders>
-                                    <w:top w:val="single" w:sz="4" w:space="0" w:color="auto"/>
-                                    <w:left w:val="single" w:sz="4" w:space="0" w:color="auto"/>
-                                    <w:bottom w:val="single" w:sz="4" w:space="0" w:color="auto"/>
-                                    <w:right w:val="single" w:sz="4" w:space="0" w:color="auto"/>
-                                  </w:tcBorders>
-                                  <w:hideMark/>
-                                </w:tcPr>
-                                <w:p>
-                                  <w:r>
-                                    <w:rPr>
-                                      <w:color w:val="000000"/>
-                                    </w:rPr>
-                                    <w:t>Automated SMS / email notification gateways</w:t>
-                                  </w:r>
-                                </w:p>
-                              </w:tc>
-                            </w:tr>
-                            <w:tr>
-                              <w:tc>
-                                <w:tcPr>
-                                  <w:tcW w:w="4400" w:type="dxa"/>
-                                  <w:tcBorders>
-                                    <w:top w:val="single" w:sz="4" w:space="0" w:color="auto"/>
-                                    <w:left w:val="single" w:sz="4" w:space="0" w:color="auto"/>
-                                    <w:bottom w:val="single" w:sz="4" w:space="0" w:color="auto"/>
-                                    <w:right w:val="single" w:sz="4" w:space="0" w:color="auto"/>
-                                  </w:tcBorders>
-                                  <w:hideMark/>
-                                </w:tcPr>
-                                <w:p>
-                                  <w:r>
-                                    <w:rPr>
-                                      <w:color w:val="000000"/>
-                                    </w:rPr>
-                                    <w:t xml:space="preserve">Local offline </w:t>
-                                  </w:r>
-                                  <w:r>
-                                    <w:rPr>
-                                      <w:color w:val="000000"/>
-                                    </w:rPr>
-                                    <w:t>database (MSSQL Server)</w:t>
-                                  </w:r>
-                                  <w:r>
-                                    <w:rPr>
-                                      <w:color w:val="000000"/>
-                                    </w:rPr>
-                                    <w:t xml:space="preserve"> with backup and restore utilities</w:t>
-                                  </w:r>
-                                </w:p>
-                              </w:tc>
-                              <w:tc>
-                                <w:tcPr>
-                                  <w:tcW w:w="4400" w:type="dxa"/>
-                                  <w:tcBorders>
-                                    <w:top w:val="single" w:sz="4" w:space="0" w:color="auto"/>
-                                    <w:left w:val="single" w:sz="4" w:space="0" w:color="auto"/>
-                                    <w:bottom w:val="single" w:sz="4" w:space="0" w:color="auto"/>
-                                    <w:right w:val="single" w:sz="4" w:space="0" w:color="auto"/>
-                                  </w:tcBorders>
-                                  <w:hideMark/>
-                                </w:tcPr>
-                                <w:p>
-                                  <w:r>
-                                    <w:rPr>
-                                      <w:color w:val="000000"/>
-                                    </w:rPr>
-                                    <w:t>Multi-building enterprise SaaS multi-tenancy</w:t>
-                                  </w:r>
-                                </w:p>
-                              </w:tc>
-                            </w:tr>
-                            <w:tr>
-                              <w:tc>
-                                <w:tcPr>
-                                  <w:tcW w:w="4400" w:type="dxa"/>
-                                  <w:tcBorders>
-                                    <w:top w:val="single" w:sz="4" w:space="0" w:color="auto"/>
-                                    <w:left w:val="single" w:sz="4" w:space="0" w:color="auto"/>
-                                    <w:bottom w:val="single" w:sz="4" w:space="0" w:color="auto"/>
-                                    <w:right w:val="single" w:sz="4" w:space="0" w:color="auto"/>
-                                  </w:tcBorders>
-                                  <w:hideMark/>
-                                </w:tcPr>
-                                <w:p>
-                                  <w:r>
-                                    <w:rPr>
-                                      <w:color w:val="000000"/>
-                                    </w:rPr>
-                                    <w:t>PDF export of maintenance reports (CR-002, Approved)</w:t>
-                                  </w:r>
-                                </w:p>
-                              </w:tc>
-                              <w:tc>
-                                <w:tcPr>
-                                  <w:tcW w:w="4400" w:type="dxa"/>
-                                  <w:tcBorders>
-                                    <w:top w:val="single" w:sz="4" w:space="0" w:color="auto"/>
-                                    <w:left w:val="single" w:sz="4" w:space="0" w:color="auto"/>
-                                    <w:bottom w:val="single" w:sz="4" w:space="0" w:color="auto"/>
-                                    <w:right w:val="single" w:sz="4" w:space="0" w:color="auto"/>
-                                  </w:tcBorders>
-                                </w:tcPr>
-                                <w:p/>
-                              </w:tc>
-                            </w:tr>
-                            <w:tr>
-                              <w:tc>
-                                <w:tcPr>
-                                  <w:tcW w:w="4400" w:type="dxa"/>
-                                  <w:tcBorders>
-                                    <w:top w:val="single" w:sz="4" w:space="0" w:color="auto"/>
-                                    <w:left w:val="single" w:sz="4" w:space="0" w:color="auto"/>
-                                    <w:bottom w:val="single" w:sz="4" w:space="0" w:color="auto"/>
-                                    <w:right w:val="single" w:sz="4" w:space="0" w:color="auto"/>
-                                  </w:tcBorders>
-                                  <w:hideMark/>
-                                </w:tcPr>
-                                <w:p>
-                                  <w:r>
-                                    <w:rPr>
-                                      <w:color w:val="000000"/>
-                                    </w:rPr>
-                                    <w:t>Arabic / English UI localization (CR-003, Approved)</w:t>
-                                  </w:r>
-                                </w:p>
-                              </w:tc>
-                              <w:tc>
-                                <w:tcPr>
-                                  <w:tcW w:w="4400" w:type="dxa"/>
-                                  <w:tcBorders>
-                                    <w:top w:val="single" w:sz="4" w:space="0" w:color="auto"/>
-                                    <w:left w:val="single" w:sz="4" w:space="0" w:color="auto"/>
-                                    <w:bottom w:val="single" w:sz="4" w:space="0" w:color="auto"/>
-                                    <w:right w:val="single" w:sz="4" w:space="0" w:color="auto"/>
-                                  </w:tcBorders>
-                                </w:tcPr>
-                                <w:p/>
-                              </w:tc>
-                            </w:tr>
-                          </w:tbl>
-                          <w:p>
-                            <w:pPr>
-                              <w:jc w:val="center"/>
-                            </w:pPr>
-                            <w:r>
-                              <w:softHyphen/>
-                            </w:r>
-                            <w:r>
-                              <w:softHyphen/>
-                            </w:r>
-                            <w:r>
-                              <w:softHyphen/>
-                            </w:r>
-                            <w:r>
-                              <w:softHyphen/>
-                            </w:r>
-                            <w:r>
-                              <w:softHyphen/>
-                            </w:r>
-                            <w:r>
-                              <w:softHyphen/>
-                            </w:r>
-                            <w:r>
-                              <w:softHyphen/>
-                            </w:r>
-                            <w:r>
-                              <w:softHyphen/>
-                            </w:r>
-                            <w:r>
-                              <w:softHyphen/>
-                            </w:r>
-                            <w:r>
-                              <w:softHyphen/>
-                            </w:r>
-                            <w:r>
-                              <w:softHyphen/>
-                            </w:r>
-                            <w:r>
-                              <w:softHyphen/>
-                            </w:r>
-                            <w:r>
-                              <w:softHyphen/>
-                            </w:r>
-                            <w:r>
-                              <w:softHyphen/>
-                            </w:r>
-                            <w:r>
-                              <w:softHyphen/>
-                            </w:r>
-                            <w:r>
-                              <w:softHyphen/>
-                            </w:r>
-                            <w:r>
-                              <w:softHyphen/>
-                            </w:r>
-                            <w:r>
-                              <w:softHyphen/>
-                            </w:r>
-                            <w:r>
-                              <w:softHyphen/>
-                            </w:r>
-                            <w:r>
-                              <w:softHyphen/>
-                            </w:r>
-                            <w:r>
-                              <w:softHyphen/>
-                            </w:r>
-                            <w:r>
-                              <w:softHyphen/>
-                            </w:r>
-                            <w:r>
-                              <w:softHyphen/>
-                            </w:r>
-                            <w:r>
-                              <w:softHyphen/>
-                            </w:r>
-                            <w:r>
-                              <w:softHyphen/>
-                            </w:r>
-                            <w:r>
-                              <w:softHyphen/>
-                            </w:r>
-                            <w:r>
-                              <w:softHyphen/>
-                            </w:r>
-                            <w:r>
-                              <w:softHyphen/>
-                            </w:r>
-                            <w:r>
-                              <w:softHyphen/>
-                            </w:r>
-                            <w:r>
-                              <w:softHyphen/>
-                            </w:r>
-                            <w:r>
-                              <w:softHyphen/>
-                            </w:r>
-                            <w:r>
-                              <w:softHyphen/>
-                            </w:r>
-                            <w:r>
-                              <w:softHyphen/>
-                            </w:r>
-                            <w:r>
-                              <w:softHyphen/>
-                            </w:r>
-                            <w:r>
-                              <w:softHyphen/>
-                            </w:r>
-                            <w:r>
-                              <w:softHyphen/>
-                            </w:r>
-                            <w:r>
-                              <w:softHyphen/>
-                            </w:r>
-                            <w:r>
-                              <w:softHyphen/>
-                            </w:r>
-                            <w:r>
-                              <w:softHyphen/>
-                            </w:r>
-                            <w:r>
-                              <w:softHyphen/>
-                            </w:r>
-                            <w:r>
-                              <w:softHyphen/>
-                            </w:r>
-                            <w:r>
-                              <w:softHyphen/>
-                            </w:r>
-                            <w:r>
-                              <w:softHyphen/>
-                            </w:r>
-                            <w:r>
-                              <w:softHyphen/>
-                            </w:r>
-                            <w:r>
-                              <w:softHyphen/>
-                            </w:r>
-                            <w:r>
-                              <w:softHyphen/>
-                            </w:r>
-                            <w:r>
-                              <w:softHyphen/>
-                            </w:r>
-                            <w:r>
-                              <w:softHyphen/>
-                            </w:r>
-                            <w:r>
-                              <w:softHyphen/>
-                            </w:r>
-                            <w:r>
-                              <w:softHyphen/>
-                            </w:r>
-                            <w:r>
-                              <w:softHyphen/>
-                            </w:r>
-                            <w:r>
-                              <w:softHyphen/>
-                            </w:r>
-                            <w:r>
-                              <w:softHyphen/>
-                            </w:r>
-                            <w:r>
-                              <w:softHyphen/>
-                            </w:r>
-                            <w:r>
-                              <w:softHyphen/>
-                            </w:r>
-                            <w:r>
-                              <w:softHyphen/>
-                            </w:r>
-                            <w:r>
-                              <w:softHyphen/>
-                            </w:r>
-                            <w:r>
-                              <w:softHyphen/>
-                            </w:r>
-                            <w:r>
-                              <w:softHyphen/>
-                            </w:r>
-                            <w:r>
-                              <w:softHyphen/>
-                            </w:r>
-                            <w:r>
-                              <w:softHyphen/>
-                            </w:r>
-                            <w:r>
-                              <w:softHyphen/>
-                            </w:r>
-                            <w:r>
-                              <w:softHyphen/>
-                            </w:r>
-                            <w:r>
-                              <w:softHyphen/>
-                            </w:r>
-                            <w:r>
-                              <w:softHyphen/>
-                            </w:r>
-                            <w:r>
-                              <w:softHyphen/>
-                            </w:r>
-                          </w:p>
-                        </w:txbxContent>
-                      </wps:txbx>
-                      <wps:bodyPr rot="0" spcFirstLastPara="0" vertOverflow="overflow" horzOverflow="overflow" vert="horz" wrap="square" lIns="91440" tIns="45720" rIns="91440" bIns="45720" numCol="1" spcCol="0" rtlCol="1" fromWordArt="0" anchor="ctr" anchorCtr="0" forceAA="0" compatLnSpc="1">
-                        <a:prstTxWarp prst="textNoShape">
-                          <a:avLst/>
-                        </a:prstTxWarp>
-                        <a:noAutofit/>
-                      </wps:bodyPr>
-                    </wps:wsp>
-                  </a:graphicData>
-                </a:graphic>
-                <wp14:sizeRelH relativeFrom="margin">
-                  <wp14:pctWidth>0</wp14:pctWidth>
-                </wp14:sizeRelH>
-                <wp14:sizeRelV relativeFrom="margin">
-                  <wp14:pctHeight>0</wp14:pctHeight>
-                </wp14:sizeRelV>
-              </wp:anchor>
-            </w:drawing>
-          </mc:Choice>
-          <mc:Fallback>
-            <w:pict>
-              <v:shapetype w14:anchorId="3A8B1D35" id="_x0000_t120" coordsize="21600,21600" o:spt="120" path="m10800,qx,10800,10800,21600,21600,10800,10800,xe">
-                <v:path gradientshapeok="t" o:connecttype="custom" o:connectlocs="10800,0;3163,3163;0,10800;3163,18437;10800,21600;18437,18437;21600,10800;18437,3163" textboxrect="3163,3163,18437,18437"/>
-              </v:shapetype>
-              <v:shape id="مخطط انسيابي: رابط 12" o:spid="_x0000_s1029" type="#_x0000_t120" style="position:absolute;margin-left:420.25pt;margin-top:53.4pt;width:14.45pt;height:15.45pt;z-index:251665408;visibility:visible;mso-wrap-style:square;mso-width-percent:0;mso-height-percent:0;mso-wrap-distance-left:9pt;mso-wrap-distance-top:0;mso-wrap-distance-right:9pt;mso-wrap-distance-bottom:0;mso-position-horizontal:absolute;mso-position-horizontal-relative:text;mso-position-vertical:absolute;mso-position-vertical-relative:text;mso-width-percent:0;mso-height-percent:0;mso-width-relative:margin;mso-height-relative:margin;v-text-anchor:middle" o:gfxdata="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" filled="f" strokecolor="white [3212]" strokeweight="1pt">
-                <v:stroke joinstyle="miter"/>
-                <v:textbox>
-                  <w:txbxContent>
-                    <w:tbl>
-                      <w:tblPr>
-                        <w:tblW w:w="8800" w:type="dxa"/>
-                        <w:tblBorders>
-                          <w:top w:val="single" w:sz="4" w:space="0" w:color="auto"/>
-                          <w:left w:val="single" w:sz="4" w:space="0" w:color="auto"/>
-                          <w:bottom w:val="single" w:sz="4" w:space="0" w:color="auto"/>
-                          <w:right w:val="single" w:sz="4" w:space="0" w:color="auto"/>
-                          <w:insideH w:val="single" w:sz="4" w:space="0" w:color="auto"/>
-                          <w:insideV w:val="single" w:sz="4" w:space="0" w:color="auto"/>
-                        </w:tblBorders>
-                        <w:tblCellMar>
-                          <w:left w:w="10" w:type="dxa"/>
-                          <w:right w:w="10" w:type="dxa"/>
-                        </w:tblCellMar>
-                        <w:tblLook w:val="04A0" w:firstRow="1" w:lastRow="0" w:firstColumn="1" w:lastColumn="0" w:noHBand="0" w:noVBand="1"/>
-                      </w:tblPr>
-                      <w:tblGrid>
-                        <w:gridCol w:w="4400"/>
-                        <w:gridCol w:w="4400"/>
-                      </w:tblGrid>
-                      <w:tr>
-                        <w:tc>
-                          <w:tcPr>
-                            <w:tcW w:w="4400" w:type="dxa"/>
-                            <w:tcBorders>
-                              <w:top w:val="single" w:sz="4" w:space="0" w:color="auto"/>
-                              <w:left w:val="single" w:sz="4" w:space="0" w:color="auto"/>
-                              <w:bottom w:val="single" w:sz="4" w:space="0" w:color="auto"/>
-                              <w:right w:val="single" w:sz="4" w:space="0" w:color="auto"/>
-                            </w:tcBorders>
-                            <w:shd w:val="clear" w:color="auto" w:fill="1F4E78"/>
-                            <w:hideMark/>
-                          </w:tcPr>
-                          <w:p>
-                            <w:r>
-                              <w:rPr>
-                                <w:b/>
-                                <w:bCs/>
-                                <w:color w:val="FFFFFF"/>
-                              </w:rPr>
-                              <w:t>In Scope</w:t>
-                            </w:r>
-                          </w:p>
-                        </w:tc>
-                        <w:tc>
-                          <w:tcPr>
-                            <w:tcW w:w="4400" w:type="dxa"/>
-                            <w:tcBorders>
-                              <w:top w:val="single" w:sz="4" w:space="0" w:color="auto"/>
-                              <w:left w:val="single" w:sz="4" w:space="0" w:color="auto"/>
-                              <w:bottom w:val="single" w:sz="4" w:space="0" w:color="auto"/>
-                              <w:right w:val="single" w:sz="4" w:space="0" w:color="auto"/>
-                            </w:tcBorders>
-                            <w:shd w:val="clear" w:color="auto" w:fill="1F4E78"/>
-                            <w:hideMark/>
-                          </w:tcPr>
-                          <w:p>
-                            <w:r>
-                              <w:rPr>
-                                <w:b/>
-                                <w:bCs/>
-                                <w:color w:val="FFFFFF"/>
-                              </w:rPr>
-                              <w:t>Out of Scope</w:t>
-                            </w:r>
-                          </w:p>
-                        </w:tc>
-                      </w:tr>
-                      <w:tr>
-                        <w:tc>
-                          <w:tcPr>
-                            <w:tcW w:w="4400" w:type="dxa"/>
-                            <w:tcBorders>
-                              <w:top w:val="single" w:sz="4" w:space="0" w:color="auto"/>
-                              <w:left w:val="single" w:sz="4" w:space="0" w:color="auto"/>
-                              <w:bottom w:val="single" w:sz="4" w:space="0" w:color="auto"/>
-                              <w:right w:val="single" w:sz="4" w:space="0" w:color="auto"/>
-                            </w:tcBorders>
-                            <w:hideMark/>
-                          </w:tcPr>
-                          <w:p>
-                            <w:r>
-                              <w:rPr>
-                                <w:color w:val="000000"/>
-                              </w:rPr>
-                              <w:t>Apartment &amp; occupancy management (Vacant / Occupied / Maintenance)</w:t>
-                            </w:r>
-                          </w:p>
-                        </w:tc>
-                        <w:tc>
-                          <w:tcPr>
-                            <w:tcW w:w="4400" w:type="dxa"/>
-                            <w:tcBorders>
-                              <w:top w:val="single" w:sz="4" w:space="0" w:color="auto"/>
-                              <w:left w:val="single" w:sz="4" w:space="0" w:color="auto"/>
-                              <w:bottom w:val="single" w:sz="4" w:space="0" w:color="auto"/>
-                              <w:right w:val="single" w:sz="4" w:space="0" w:color="auto"/>
-                            </w:tcBorders>
-                            <w:hideMark/>
-                          </w:tcPr>
-                          <w:p>
-                            <w:r>
-                              <w:rPr>
-                                <w:color w:val="000000"/>
-                              </w:rPr>
-                              <w:t>Online payment gateways (</w:t>
-                            </w:r>
-                            <w:proofErr w:type="spellStart"/>
-                            <w:r>
-                              <w:rPr>
-                                <w:color w:val="000000"/>
-                              </w:rPr>
-                              <w:t>Jaib</w:t>
-                            </w:r>
-                            <w:proofErr w:type="spellEnd"/>
-                            <w:r>
-                              <w:rPr>
-                                <w:color w:val="000000"/>
-                              </w:rPr>
-                              <w:t xml:space="preserve">, </w:t>
-                            </w:r>
-                            <w:proofErr w:type="spellStart"/>
-                            <w:r>
-                              <w:rPr>
-                                <w:color w:val="000000"/>
-                              </w:rPr>
-                              <w:t>OneCash</w:t>
-                            </w:r>
-                            <w:proofErr w:type="spellEnd"/>
-                            <w:r>
-                              <w:rPr>
-                                <w:color w:val="000000"/>
-                              </w:rPr>
-                              <w:t>, Stripe, banking APIs) — CR-001 Rejected</w:t>
-                            </w:r>
-                          </w:p>
-                        </w:tc>
-                      </w:tr>
-                      <w:tr>
-                        <w:tc>
-                          <w:tcPr>
-                            <w:tcW w:w="4400" w:type="dxa"/>
-                            <w:tcBorders>
-                              <w:top w:val="single" w:sz="4" w:space="0" w:color="auto"/>
-                              <w:left w:val="single" w:sz="4" w:space="0" w:color="auto"/>
-                              <w:bottom w:val="single" w:sz="4" w:space="0" w:color="auto"/>
-                              <w:right w:val="single" w:sz="4" w:space="0" w:color="auto"/>
-                            </w:tcBorders>
-                            <w:hideMark/>
-                          </w:tcPr>
-                          <w:p>
-                            <w:r>
-                              <w:rPr>
-                                <w:color w:val="000000"/>
-                              </w:rPr>
-                              <w:t>Rent &amp; payment tracking (cash / dockets, overdue balances, receipts)</w:t>
-                            </w:r>
-                          </w:p>
-                        </w:tc>
-                        <w:tc>
-                          <w:tcPr>
-                            <w:tcW w:w="4400" w:type="dxa"/>
-                            <w:tcBorders>
-                              <w:top w:val="single" w:sz="4" w:space="0" w:color="auto"/>
-                              <w:left w:val="single" w:sz="4" w:space="0" w:color="auto"/>
-                              <w:bottom w:val="single" w:sz="4" w:space="0" w:color="auto"/>
-                              <w:right w:val="single" w:sz="4" w:space="0" w:color="auto"/>
-                            </w:tcBorders>
-                            <w:hideMark/>
-                          </w:tcPr>
-                          <w:p>
-                            <w:r>
-                              <w:rPr>
-                                <w:color w:val="000000"/>
-                              </w:rPr>
-                              <w:t xml:space="preserve">Cloud </w:t>
-                            </w:r>
-                            <w:r>
-                              <w:rPr>
-                                <w:color w:val="000000"/>
-                              </w:rPr>
-                              <w:t>database (MSSQL Server)</w:t>
-                            </w:r>
-                            <w:r>
-                              <w:rPr>
-                                <w:color w:val="000000"/>
-                              </w:rPr>
-                              <w:t xml:space="preserve"> synchronization and remote APIs</w:t>
-                            </w:r>
-                          </w:p>
-                        </w:tc>
-                      </w:tr>
-                      <w:tr>
-                        <w:tc>
-                          <w:tcPr>
-                            <w:tcW w:w="4400" w:type="dxa"/>
-                            <w:tcBorders>
-                              <w:top w:val="single" w:sz="4" w:space="0" w:color="auto"/>
-                              <w:left w:val="single" w:sz="4" w:space="0" w:color="auto"/>
-                              <w:bottom w:val="single" w:sz="4" w:space="0" w:color="auto"/>
-                              <w:right w:val="single" w:sz="4" w:space="0" w:color="auto"/>
-                            </w:tcBorders>
-                            <w:hideMark/>
-                          </w:tcPr>
-                          <w:p>
-                            <w:r>
-                              <w:rPr>
-                                <w:color w:val="000000"/>
-                              </w:rPr>
-                              <w:t>Maintenance &amp; issue logging (Open / In Progress / Resolved)</w:t>
-                            </w:r>
-                          </w:p>
-                        </w:tc>
-                        <w:tc>
-                          <w:tcPr>
-                            <w:tcW w:w="4400" w:type="dxa"/>
-                            <w:tcBorders>
-                              <w:top w:val="single" w:sz="4" w:space="0" w:color="auto"/>
-                              <w:left w:val="single" w:sz="4" w:space="0" w:color="auto"/>
-                              <w:bottom w:val="single" w:sz="4" w:space="0" w:color="auto"/>
-                              <w:right w:val="single" w:sz="4" w:space="0" w:color="auto"/>
-                            </w:tcBorders>
-                            <w:hideMark/>
-                          </w:tcPr>
-                          <w:p>
-                            <w:r>
-                              <w:rPr>
-                                <w:color w:val="000000"/>
-                              </w:rPr>
-                              <w:t>Tenant mobile applications (iOS / Android)</w:t>
-                            </w:r>
-                          </w:p>
-                        </w:tc>
-                      </w:tr>
-                      <w:tr>
-                        <w:tc>
-                          <w:tcPr>
-                            <w:tcW w:w="4400" w:type="dxa"/>
-                            <w:tcBorders>
-                              <w:top w:val="single" w:sz="4" w:space="0" w:color="auto"/>
-                              <w:left w:val="single" w:sz="4" w:space="0" w:color="auto"/>
-                              <w:bottom w:val="single" w:sz="4" w:space="0" w:color="auto"/>
-                              <w:right w:val="single" w:sz="4" w:space="0" w:color="auto"/>
-                            </w:tcBorders>
-                            <w:hideMark/>
-                          </w:tcPr>
-                          <w:p>
-                            <w:r>
-                              <w:rPr>
-                                <w:color w:val="000000"/>
-                              </w:rPr>
-                              <w:t>Package &amp; parcel receiving and pickup tracking</w:t>
-                            </w:r>
-                          </w:p>
-                        </w:tc>
-                        <w:tc>
-                          <w:tcPr>
-                            <w:tcW w:w="4400" w:type="dxa"/>
-                            <w:tcBorders>
-                              <w:top w:val="single" w:sz="4" w:space="0" w:color="auto"/>
-                              <w:left w:val="single" w:sz="4" w:space="0" w:color="auto"/>
-                              <w:bottom w:val="single" w:sz="4" w:space="0" w:color="auto"/>
-                              <w:right w:val="single" w:sz="4" w:space="0" w:color="auto"/>
-                            </w:tcBorders>
-                            <w:hideMark/>
-                          </w:tcPr>
-                          <w:p>
-                            <w:r>
-                              <w:rPr>
-                                <w:color w:val="000000"/>
-                              </w:rPr>
-                              <w:t>Automated SMS / email notification gateways</w:t>
-                            </w:r>
-                          </w:p>
-                        </w:tc>
-                      </w:tr>
-                      <w:tr>
-                        <w:tc>
-                          <w:tcPr>
-                            <w:tcW w:w="4400" w:type="dxa"/>
-                            <w:tcBorders>
-                              <w:top w:val="single" w:sz="4" w:space="0" w:color="auto"/>
-                              <w:left w:val="single" w:sz="4" w:space="0" w:color="auto"/>
-                              <w:bottom w:val="single" w:sz="4" w:space="0" w:color="auto"/>
-                              <w:right w:val="single" w:sz="4" w:space="0" w:color="auto"/>
-                            </w:tcBorders>
-                            <w:hideMark/>
-                          </w:tcPr>
-                          <w:p>
-                            <w:r>
-                              <w:rPr>
-                                <w:color w:val="000000"/>
-                              </w:rPr>
-                              <w:t xml:space="preserve">Local offline </w:t>
-                            </w:r>
-                            <w:r>
-                              <w:rPr>
-                                <w:color w:val="000000"/>
-                              </w:rPr>
-                              <w:t>database (MSSQL Server)</w:t>
-                            </w:r>
-                            <w:r>
-                              <w:rPr>
-                                <w:color w:val="000000"/>
-                              </w:rPr>
-                              <w:t xml:space="preserve"> with backup and restore utilities</w:t>
-                            </w:r>
-                          </w:p>
-                        </w:tc>
-                        <w:tc>
-                          <w:tcPr>
-                            <w:tcW w:w="4400" w:type="dxa"/>
-                            <w:tcBorders>
-                              <w:top w:val="single" w:sz="4" w:space="0" w:color="auto"/>
-                              <w:left w:val="single" w:sz="4" w:space="0" w:color="auto"/>
-                              <w:bottom w:val="single" w:sz="4" w:space="0" w:color="auto"/>
-                              <w:right w:val="single" w:sz="4" w:space="0" w:color="auto"/>
-                            </w:tcBorders>
-                            <w:hideMark/>
-                          </w:tcPr>
-                          <w:p>
-                            <w:r>
-                              <w:rPr>
-                                <w:color w:val="000000"/>
-                              </w:rPr>
-                              <w:t>Multi-building enterprise SaaS multi-tenancy</w:t>
-                            </w:r>
-                          </w:p>
-                        </w:tc>
-                      </w:tr>
-                      <w:tr>
-                        <w:tc>
-                          <w:tcPr>
-                            <w:tcW w:w="4400" w:type="dxa"/>
-                            <w:tcBorders>
-                              <w:top w:val="single" w:sz="4" w:space="0" w:color="auto"/>
-                              <w:left w:val="single" w:sz="4" w:space="0" w:color="auto"/>
-                              <w:bottom w:val="single" w:sz="4" w:space="0" w:color="auto"/>
-                              <w:right w:val="single" w:sz="4" w:space="0" w:color="auto"/>
-                            </w:tcBorders>
-                            <w:hideMark/>
-                          </w:tcPr>
-                          <w:p>
-                            <w:r>
-                              <w:rPr>
-                                <w:color w:val="000000"/>
-                              </w:rPr>
-                              <w:t>PDF export of maintenance reports (CR-002, Approved)</w:t>
-                            </w:r>
-                          </w:p>
-                        </w:tc>
-                        <w:tc>
-                          <w:tcPr>
-                            <w:tcW w:w="4400" w:type="dxa"/>
-                            <w:tcBorders>
-                              <w:top w:val="single" w:sz="4" w:space="0" w:color="auto"/>
-                              <w:left w:val="single" w:sz="4" w:space="0" w:color="auto"/>
-                              <w:bottom w:val="single" w:sz="4" w:space="0" w:color="auto"/>
-                              <w:right w:val="single" w:sz="4" w:space="0" w:color="auto"/>
-                            </w:tcBorders>
-                          </w:tcPr>
-                          <w:p/>
-                        </w:tc>
-                      </w:tr>
-                      <w:tr>
-                        <w:tc>
-                          <w:tcPr>
-                            <w:tcW w:w="4400" w:type="dxa"/>
-                            <w:tcBorders>
-                              <w:top w:val="single" w:sz="4" w:space="0" w:color="auto"/>
-                              <w:left w:val="single" w:sz="4" w:space="0" w:color="auto"/>
-                              <w:bottom w:val="single" w:sz="4" w:space="0" w:color="auto"/>
-                              <w:right w:val="single" w:sz="4" w:space="0" w:color="auto"/>
-                            </w:tcBorders>
-                            <w:hideMark/>
-                          </w:tcPr>
-                          <w:p>
-                            <w:r>
-                              <w:rPr>
-                                <w:color w:val="000000"/>
-                              </w:rPr>
-                              <w:t>Arabic / English UI localization (CR-003, Approved)</w:t>
-                            </w:r>
-                          </w:p>
-                        </w:tc>
-                        <w:tc>
-                          <w:tcPr>
-                            <w:tcW w:w="4400" w:type="dxa"/>
-                            <w:tcBorders>
-                              <w:top w:val="single" w:sz="4" w:space="0" w:color="auto"/>
-                              <w:left w:val="single" w:sz="4" w:space="0" w:color="auto"/>
-                              <w:bottom w:val="single" w:sz="4" w:space="0" w:color="auto"/>
-                              <w:right w:val="single" w:sz="4" w:space="0" w:color="auto"/>
-                            </w:tcBorders>
-                          </w:tcPr>
-                          <w:p/>
-                        </w:tc>
-                      </w:tr>
-                    </w:tbl>
-                    <w:p>
-                      <w:pPr>
-                        <w:jc w:val="center"/>
-                      </w:pPr>
-                      <w:r>
-                        <w:softHyphen/>
-                      </w:r>
-                      <w:r>
-                        <w:softHyphen/>
-                      </w:r>
-                      <w:r>
-                        <w:softHyphen/>
-                      </w:r>
-                      <w:r>
-                        <w:softHyphen/>
-                      </w:r>
-                      <w:r>
-                        <w:softHyphen/>
-                      </w:r>
-                      <w:r>
-                        <w:softHyphen/>
-                      </w:r>
-                      <w:r>
-                        <w:softHyphen/>
-                      </w:r>
-                      <w:r>
-                        <w:softHyphen/>
-                      </w:r>
-                      <w:r>
-                        <w:softHyphen/>
-                      </w:r>
-                      <w:r>
-                        <w:softHyphen/>
-                      </w:r>
-                      <w:r>
-                        <w:softHyphen/>
-                      </w:r>
-                      <w:r>
-                        <w:softHyphen/>
-                      </w:r>
-                      <w:r>
-                        <w:softHyphen/>
-                      </w:r>
-                      <w:r>
-                        <w:softHyphen/>
-                      </w:r>
-                      <w:r>
-                        <w:softHyphen/>
-                      </w:r>
-                      <w:r>
-                        <w:softHyphen/>
-                      </w:r>
-                      <w:r>
-                        <w:softHyphen/>
-                      </w:r>
-                      <w:r>
-                        <w:softHyphen/>
-                      </w:r>
-                      <w:r>
-                        <w:softHyphen/>
-                      </w:r>
-                      <w:r>
-                        <w:softHyphen/>
-                      </w:r>
-                      <w:r>
-                        <w:softHyphen/>
-                      </w:r>
-                      <w:r>
-                        <w:softHyphen/>
-                      </w:r>
-                      <w:r>
-                        <w:softHyphen/>
-                      </w:r>
-                      <w:r>
-                        <w:softHyphen/>
-                      </w:r>
-                      <w:r>
-                        <w:softHyphen/>
-                      </w:r>
-                      <w:r>
-                        <w:softHyphen/>
-                      </w:r>
-                      <w:r>
-                        <w:softHyphen/>
-                      </w:r>
-                      <w:r>
-                        <w:softHyphen/>
-                      </w:r>
-                      <w:r>
-                        <w:softHyphen/>
-                      </w:r>
-                      <w:r>
-                        <w:softHyphen/>
-                      </w:r>
-                      <w:r>
-                        <w:softHyphen/>
-                      </w:r>
-                      <w:r>
-                        <w:softHyphen/>
-                      </w:r>
-                      <w:r>
-                        <w:softHyphen/>
-                      </w:r>
-                      <w:r>
-                        <w:softHyphen/>
-                      </w:r>
-                      <w:r>
-                        <w:softHyphen/>
-                      </w:r>
-                      <w:r>
-                        <w:softHyphen/>
-                      </w:r>
-                      <w:r>
-                        <w:softHyphen/>
-                      </w:r>
-                      <w:r>
-                        <w:softHyphen/>
-                      </w:r>
-                      <w:r>
-                        <w:softHyphen/>
-                      </w:r>
-                      <w:r>
-                        <w:softHyphen/>
-                      </w:r>
-                      <w:r>
-                        <w:softHyphen/>
-                      </w:r>
-                      <w:r>
-                        <w:softHyphen/>
-                      </w:r>
-                      <w:r>
-                        <w:softHyphen/>
-                      </w:r>
-                      <w:r>
-                        <w:softHyphen/>
-                      </w:r>
-                      <w:r>
-                        <w:softHyphen/>
-                      </w:r>
-                      <w:r>
-                        <w:softHyphen/>
-                      </w:r>
-                      <w:r>
-                        <w:softHyphen/>
-                      </w:r>
-                      <w:r>
-                        <w:softHyphen/>
-                      </w:r>
-                      <w:r>
-                        <w:softHyphen/>
-                      </w:r>
-                      <w:r>
-                        <w:softHyphen/>
-                      </w:r>
-                      <w:r>
-                        <w:softHyphen/>
-                      </w:r>
-                      <w:r>
-                        <w:softHyphen/>
-                      </w:r>
-                      <w:r>
-                        <w:softHyphen/>
-                      </w:r>
-                      <w:r>
-                        <w:softHyphen/>
-                      </w:r>
-                      <w:r>
-                        <w:softHyphen/>
-                      </w:r>
-                      <w:r>
-                        <w:softHyphen/>
-                      </w:r>
-                      <w:r>
-                        <w:softHyphen/>
-                      </w:r>
-                      <w:r>
-                        <w:softHyphen/>
-                      </w:r>
-                      <w:r>
-                        <w:softHyphen/>
-                      </w:r>
-                      <w:r>
-                        <w:softHyphen/>
-                      </w:r>
-                      <w:r>
-                        <w:softHyphen/>
-                      </w:r>
-                      <w:r>
-                        <w:softHyphen/>
-                      </w:r>
-                      <w:r>
-                        <w:softHyphen/>
-                      </w:r>
-                      <w:r>
-                        <w:softHyphen/>
-                      </w:r>
-                      <w:r>
-                        <w:softHyphen/>
-                      </w:r>
-                      <w:r>
-                        <w:softHyphen/>
-                      </w:r>
-                    </w:p>
-                  </w:txbxContent>
-                </v:textbox>
-              </v:shape>
-            </w:pict>
-          </mc:Fallback>
-        </mc:AlternateContent>
+        <w:drawing>
+          <wp:inline distT="0" distB="0" distL="0" distR="0" wp14:anchorId="0083C85A" wp14:editId="2D363E36">
+            <wp:extent cx="6391275" cy="5895975"/>
+            <wp:effectExtent l="0" t="0" r="9525" b="9525"/>
+            <wp:docPr id="15" name="صورة 15"/>
+            <wp:cNvGraphicFramePr>
+              <a:graphicFrameLocks xmlns:a="http://schemas.openxmlformats.org/drawingml/2006/main" noChangeAspect="1"/>
+            </wp:cNvGraphicFramePr>
+            <a:graphic xmlns:a="http://schemas.openxmlformats.org/drawingml/2006/main">
+              <a:graphicData uri="http://schemas.openxmlformats.org/drawingml/2006/picture">
+                <pic:pic xmlns:pic="http://schemas.openxmlformats.org/drawingml/2006/picture">
+                  <pic:nvPicPr>
+                    <pic:cNvPr id="0" name="Picture 2"/>
+                    <pic:cNvPicPr>
+                      <a:picLocks noChangeAspect="1" noChangeArrowheads="1"/>
+                    </pic:cNvPicPr>
+                  </pic:nvPicPr>
+                  <pic:blipFill>
+                    <a:blip r:embed="rId11">
+                      <a:extLst>
+                        <a:ext uri="{28A0092B-C50C-407E-A947-70E740481C1C}">
+                          <a14:useLocalDpi xmlns:a14="http://schemas.microsoft.com/office/drawing/2010/main" val="0"/>
+                        </a:ext>
+                      </a:extLst>
+                    </a:blip>
+                    <a:srcRect/>
+                    <a:stretch>
+                      <a:fillRect/>
+                    </a:stretch>
+                  </pic:blipFill>
+                  <pic:spPr bwMode="auto">
+                    <a:xfrm>
+                      <a:off x="0" y="0"/>
+                      <a:ext cx="6391275" cy="5895975"/>
+                    </a:xfrm>
+                    <a:prstGeom prst="rect">
+                      <a:avLst/>
+                    </a:prstGeom>
+                    <a:noFill/>
+                    <a:ln>
+                      <a:noFill/>
+                    </a:ln>
+                  </pic:spPr>
+                </pic:pic>
+              </a:graphicData>
+            </a:graphic>
+          </wp:inline>
+        </w:drawing>
       </w:r>
       <w:r>
         <w:rPr>
@@ -38414,908 +36787,7 @@
         <mc:AlternateContent>
           <mc:Choice Requires="wps">
             <w:drawing>
-              <wp:anchor distT="0" distB="0" distL="114300" distR="114300" simplePos="0" relativeHeight="251667456" behindDoc="0" locked="0" layoutInCell="1" allowOverlap="1" wp14:anchorId="44E98ECC" wp14:editId="29D5A498">
-                <wp:simplePos x="0" y="0"/>
-                <wp:positionH relativeFrom="column">
-                  <wp:posOffset>5327650</wp:posOffset>
-                </wp:positionH>
-                <wp:positionV relativeFrom="paragraph">
-                  <wp:posOffset>702523</wp:posOffset>
-                </wp:positionV>
-                <wp:extent cx="117198" cy="135386"/>
-                <wp:effectExtent l="0" t="0" r="16510" b="17145"/>
-                <wp:wrapNone/>
-                <wp:docPr id="14" name="مخطط انسيابي: رابط 14"/>
-                <wp:cNvGraphicFramePr/>
-                <a:graphic xmlns:a="http://schemas.openxmlformats.org/drawingml/2006/main">
-                  <a:graphicData uri="http://schemas.microsoft.com/office/word/2010/wordprocessingShape">
-                    <wps:wsp>
-                      <wps:cNvSpPr/>
-                      <wps:spPr>
-                        <a:xfrm>
-                          <a:off x="0" y="0"/>
-                          <a:ext cx="117198" cy="135386"/>
-                        </a:xfrm>
-                        <a:prstGeom prst="flowChartConnector">
-                          <a:avLst/>
-                        </a:prstGeom>
-                        <a:noFill/>
-                        <a:ln>
-                          <a:solidFill>
-                            <a:schemeClr val="bg1"/>
-                          </a:solidFill>
-                        </a:ln>
-                      </wps:spPr>
-                      <wps:style>
-                        <a:lnRef idx="2">
-                          <a:schemeClr val="accent1">
-                            <a:shade val="50000"/>
-                          </a:schemeClr>
-                        </a:lnRef>
-                        <a:fillRef idx="1">
-                          <a:schemeClr val="accent1"/>
-                        </a:fillRef>
-                        <a:effectRef idx="0">
-                          <a:schemeClr val="accent1"/>
-                        </a:effectRef>
-                        <a:fontRef idx="minor">
-                          <a:schemeClr val="lt1"/>
-                        </a:fontRef>
-                      </wps:style>
-                      <wps:txbx>
-                        <w:txbxContent>
-                          <w:tbl>
-                            <w:tblPr>
-                              <w:tblW w:w="8800" w:type="dxa"/>
-                              <w:tblBorders>
-                                <w:top w:val="single" w:sz="4" w:space="0" w:color="auto"/>
-                                <w:left w:val="single" w:sz="4" w:space="0" w:color="auto"/>
-                                <w:bottom w:val="single" w:sz="4" w:space="0" w:color="auto"/>
-                                <w:right w:val="single" w:sz="4" w:space="0" w:color="auto"/>
-                                <w:insideH w:val="single" w:sz="4" w:space="0" w:color="auto"/>
-                                <w:insideV w:val="single" w:sz="4" w:space="0" w:color="auto"/>
-                              </w:tblBorders>
-                              <w:tblCellMar>
-                                <w:left w:w="10" w:type="dxa"/>
-                                <w:right w:w="10" w:type="dxa"/>
-                              </w:tblCellMar>
-                              <w:tblLook w:val="04A0" w:firstRow="1" w:lastRow="0" w:firstColumn="1" w:lastColumn="0" w:noHBand="0" w:noVBand="1"/>
-                            </w:tblPr>
-                            <w:tblGrid>
-                              <w:gridCol w:w="4400"/>
-                              <w:gridCol w:w="4400"/>
-                            </w:tblGrid>
-                            <w:tr>
-                              <w:tc>
-                                <w:tcPr>
-                                  <w:tcW w:w="4400" w:type="dxa"/>
-                                  <w:tcBorders>
-                                    <w:top w:val="single" w:sz="4" w:space="0" w:color="auto"/>
-                                    <w:left w:val="single" w:sz="4" w:space="0" w:color="auto"/>
-                                    <w:bottom w:val="single" w:sz="4" w:space="0" w:color="auto"/>
-                                    <w:right w:val="single" w:sz="4" w:space="0" w:color="auto"/>
-                                  </w:tcBorders>
-                                  <w:shd w:val="clear" w:color="auto" w:fill="1F4E78"/>
-                                  <w:hideMark/>
-                                </w:tcPr>
-                                <w:p>
-                                  <w:r>
-                                    <w:rPr>
-                                      <w:b/>
-                                      <w:bCs/>
-                                      <w:color w:val="FFFFFF"/>
-                                    </w:rPr>
-                                    <w:t>In Scope</w:t>
-                                  </w:r>
-                                </w:p>
-                              </w:tc>
-                              <w:tc>
-                                <w:tcPr>
-                                  <w:tcW w:w="4400" w:type="dxa"/>
-                                  <w:tcBorders>
-                                    <w:top w:val="single" w:sz="4" w:space="0" w:color="auto"/>
-                                    <w:left w:val="single" w:sz="4" w:space="0" w:color="auto"/>
-                                    <w:bottom w:val="single" w:sz="4" w:space="0" w:color="auto"/>
-                                    <w:right w:val="single" w:sz="4" w:space="0" w:color="auto"/>
-                                  </w:tcBorders>
-                                  <w:shd w:val="clear" w:color="auto" w:fill="1F4E78"/>
-                                  <w:hideMark/>
-                                </w:tcPr>
-                                <w:p>
-                                  <w:r>
-                                    <w:rPr>
-                                      <w:b/>
-                                      <w:bCs/>
-                                      <w:color w:val="FFFFFF"/>
-                                    </w:rPr>
-                                    <w:t>Out of Scope</w:t>
-                                  </w:r>
-                                </w:p>
-                              </w:tc>
-                            </w:tr>
-                            <w:tr>
-                              <w:tc>
-                                <w:tcPr>
-                                  <w:tcW w:w="4400" w:type="dxa"/>
-                                  <w:tcBorders>
-                                    <w:top w:val="single" w:sz="4" w:space="0" w:color="auto"/>
-                                    <w:left w:val="single" w:sz="4" w:space="0" w:color="auto"/>
-                                    <w:bottom w:val="single" w:sz="4" w:space="0" w:color="auto"/>
-                                    <w:right w:val="single" w:sz="4" w:space="0" w:color="auto"/>
-                                  </w:tcBorders>
-                                  <w:hideMark/>
-                                </w:tcPr>
-                                <w:p>
-                                  <w:r>
-                                    <w:rPr>
-                                      <w:color w:val="000000"/>
-                                    </w:rPr>
-                                    <w:t>Apartment &amp; occupancy management (Vacant / Occupied / Maintenance)</w:t>
-                                  </w:r>
-                                </w:p>
-                              </w:tc>
-                              <w:tc>
-                                <w:tcPr>
-                                  <w:tcW w:w="4400" w:type="dxa"/>
-                                  <w:tcBorders>
-                                    <w:top w:val="single" w:sz="4" w:space="0" w:color="auto"/>
-                                    <w:left w:val="single" w:sz="4" w:space="0" w:color="auto"/>
-                                    <w:bottom w:val="single" w:sz="4" w:space="0" w:color="auto"/>
-                                    <w:right w:val="single" w:sz="4" w:space="0" w:color="auto"/>
-                                  </w:tcBorders>
-                                  <w:hideMark/>
-                                </w:tcPr>
-                                <w:p>
-                                  <w:r>
-                                    <w:rPr>
-                                      <w:color w:val="000000"/>
-                                    </w:rPr>
-                                    <w:t>Online payment gateways (</w:t>
-                                  </w:r>
-                                  <w:proofErr w:type="spellStart"/>
-                                  <w:r>
-                                    <w:rPr>
-                                      <w:color w:val="000000"/>
-                                    </w:rPr>
-                                    <w:t>Jaib</w:t>
-                                  </w:r>
-                                  <w:proofErr w:type="spellEnd"/>
-                                  <w:r>
-                                    <w:rPr>
-                                      <w:color w:val="000000"/>
-                                    </w:rPr>
-                                    <w:t xml:space="preserve">, </w:t>
-                                  </w:r>
-                                  <w:proofErr w:type="spellStart"/>
-                                  <w:r>
-                                    <w:rPr>
-                                      <w:color w:val="000000"/>
-                                    </w:rPr>
-                                    <w:t>OneCash</w:t>
-                                  </w:r>
-                                  <w:proofErr w:type="spellEnd"/>
-                                  <w:r>
-                                    <w:rPr>
-                                      <w:color w:val="000000"/>
-                                    </w:rPr>
-                                    <w:t>, Stripe, banking APIs) — CR-001 Rejected</w:t>
-                                  </w:r>
-                                </w:p>
-                              </w:tc>
-                            </w:tr>
-                            <w:tr>
-                              <w:tc>
-                                <w:tcPr>
-                                  <w:tcW w:w="4400" w:type="dxa"/>
-                                  <w:tcBorders>
-                                    <w:top w:val="single" w:sz="4" w:space="0" w:color="auto"/>
-                                    <w:left w:val="single" w:sz="4" w:space="0" w:color="auto"/>
-                                    <w:bottom w:val="single" w:sz="4" w:space="0" w:color="auto"/>
-                                    <w:right w:val="single" w:sz="4" w:space="0" w:color="auto"/>
-                                  </w:tcBorders>
-                                  <w:hideMark/>
-                                </w:tcPr>
-                                <w:p>
-                                  <w:r>
-                                    <w:rPr>
-                                      <w:color w:val="000000"/>
-                                    </w:rPr>
-                                    <w:t>Rent &amp; payment tracking (cash / dockets, overdue balances, receipts)</w:t>
-                                  </w:r>
-                                </w:p>
-                              </w:tc>
-                              <w:tc>
-                                <w:tcPr>
-                                  <w:tcW w:w="4400" w:type="dxa"/>
-                                  <w:tcBorders>
-                                    <w:top w:val="single" w:sz="4" w:space="0" w:color="auto"/>
-                                    <w:left w:val="single" w:sz="4" w:space="0" w:color="auto"/>
-                                    <w:bottom w:val="single" w:sz="4" w:space="0" w:color="auto"/>
-                                    <w:right w:val="single" w:sz="4" w:space="0" w:color="auto"/>
-                                  </w:tcBorders>
-                                  <w:hideMark/>
-                                </w:tcPr>
-                                <w:p>
-                                  <w:r>
-                                    <w:rPr>
-                                      <w:color w:val="000000"/>
-                                    </w:rPr>
-                                    <w:t xml:space="preserve">Cloud </w:t>
-                                  </w:r>
-                                  <w:r>
-                                    <w:rPr>
-                                      <w:color w:val="000000"/>
-                                    </w:rPr>
-                                    <w:t>database (MSSQL Server)</w:t>
-                                  </w:r>
-                                  <w:r>
-                                    <w:rPr>
-                                      <w:color w:val="000000"/>
-                                    </w:rPr>
-                                    <w:t xml:space="preserve"> synchronization and remote APIs</w:t>
-                                  </w:r>
-                                </w:p>
-                              </w:tc>
-                            </w:tr>
-                            <w:tr>
-                              <w:tc>
-                                <w:tcPr>
-                                  <w:tcW w:w="4400" w:type="dxa"/>
-                                  <w:tcBorders>
-                                    <w:top w:val="single" w:sz="4" w:space="0" w:color="auto"/>
-                                    <w:left w:val="single" w:sz="4" w:space="0" w:color="auto"/>
-                                    <w:bottom w:val="single" w:sz="4" w:space="0" w:color="auto"/>
-                                    <w:right w:val="single" w:sz="4" w:space="0" w:color="auto"/>
-                                  </w:tcBorders>
-                                  <w:hideMark/>
-                                </w:tcPr>
-                                <w:p>
-                                  <w:r>
-                                    <w:rPr>
-                                      <w:color w:val="000000"/>
-                                    </w:rPr>
-                                    <w:t>Maintenance &amp; issue logging (Open / In Progress / Resolved)</w:t>
-                                  </w:r>
-                                </w:p>
-                              </w:tc>
-                              <w:tc>
-                                <w:tcPr>
-                                  <w:tcW w:w="4400" w:type="dxa"/>
-                                  <w:tcBorders>
-                                    <w:top w:val="single" w:sz="4" w:space="0" w:color="auto"/>
-                                    <w:left w:val="single" w:sz="4" w:space="0" w:color="auto"/>
-                                    <w:bottom w:val="single" w:sz="4" w:space="0" w:color="auto"/>
-                                    <w:right w:val="single" w:sz="4" w:space="0" w:color="auto"/>
-                                  </w:tcBorders>
-                                  <w:hideMark/>
-                                </w:tcPr>
-                                <w:p>
-                                  <w:r>
-                                    <w:rPr>
-                                      <w:color w:val="000000"/>
-                                    </w:rPr>
-                                    <w:t>Tenant mobile applications (iOS / Android)</w:t>
-                                  </w:r>
-                                </w:p>
-                              </w:tc>
-                            </w:tr>
-                            <w:tr>
-                              <w:tc>
-                                <w:tcPr>
-                                  <w:tcW w:w="4400" w:type="dxa"/>
-                                  <w:tcBorders>
-                                    <w:top w:val="single" w:sz="4" w:space="0" w:color="auto"/>
-                                    <w:left w:val="single" w:sz="4" w:space="0" w:color="auto"/>
-                                    <w:bottom w:val="single" w:sz="4" w:space="0" w:color="auto"/>
-                                    <w:right w:val="single" w:sz="4" w:space="0" w:color="auto"/>
-                                  </w:tcBorders>
-                                  <w:hideMark/>
-                                </w:tcPr>
-                                <w:p>
-                                  <w:r>
-                                    <w:rPr>
-                                      <w:color w:val="000000"/>
-                                    </w:rPr>
-                                    <w:t>Package &amp; parcel receiving and pickup tracking</w:t>
-                                  </w:r>
-                                </w:p>
-                              </w:tc>
-                              <w:tc>
-                                <w:tcPr>
-                                  <w:tcW w:w="4400" w:type="dxa"/>
-                                  <w:tcBorders>
-                                    <w:top w:val="single" w:sz="4" w:space="0" w:color="auto"/>
-                                    <w:left w:val="single" w:sz="4" w:space="0" w:color="auto"/>
-                                    <w:bottom w:val="single" w:sz="4" w:space="0" w:color="auto"/>
-                                    <w:right w:val="single" w:sz="4" w:space="0" w:color="auto"/>
-                                  </w:tcBorders>
-                                  <w:hideMark/>
-                                </w:tcPr>
-                                <w:p>
-                                  <w:r>
-                                    <w:rPr>
-                                      <w:color w:val="000000"/>
-                                    </w:rPr>
-                                    <w:t>Automated SMS / email notification gateways</w:t>
-                                  </w:r>
-                                </w:p>
-                              </w:tc>
-                            </w:tr>
-                            <w:tr>
-                              <w:tc>
-                                <w:tcPr>
-                                  <w:tcW w:w="4400" w:type="dxa"/>
-                                  <w:tcBorders>
-                                    <w:top w:val="single" w:sz="4" w:space="0" w:color="auto"/>
-                                    <w:left w:val="single" w:sz="4" w:space="0" w:color="auto"/>
-                                    <w:bottom w:val="single" w:sz="4" w:space="0" w:color="auto"/>
-                                    <w:right w:val="single" w:sz="4" w:space="0" w:color="auto"/>
-                                  </w:tcBorders>
-                                  <w:hideMark/>
-                                </w:tcPr>
-                                <w:p>
-                                  <w:r>
-                                    <w:rPr>
-                                      <w:color w:val="000000"/>
-                                    </w:rPr>
-                                    <w:t xml:space="preserve">Local offline </w:t>
-                                  </w:r>
-                                  <w:r>
-                                    <w:rPr>
-                                      <w:color w:val="000000"/>
-                                    </w:rPr>
-                                    <w:t>database (MSSQL Server)</w:t>
-                                  </w:r>
-                                  <w:r>
-                                    <w:rPr>
-                                      <w:color w:val="000000"/>
-                                    </w:rPr>
-                                    <w:t xml:space="preserve"> with backup and restore utilities</w:t>
-                                  </w:r>
-                                </w:p>
-                              </w:tc>
-                              <w:tc>
-                                <w:tcPr>
-                                  <w:tcW w:w="4400" w:type="dxa"/>
-                                  <w:tcBorders>
-                                    <w:top w:val="single" w:sz="4" w:space="0" w:color="auto"/>
-                                    <w:left w:val="single" w:sz="4" w:space="0" w:color="auto"/>
-                                    <w:bottom w:val="single" w:sz="4" w:space="0" w:color="auto"/>
-                                    <w:right w:val="single" w:sz="4" w:space="0" w:color="auto"/>
-                                  </w:tcBorders>
-                                  <w:hideMark/>
-                                </w:tcPr>
-                                <w:p>
-                                  <w:r>
-                                    <w:rPr>
-                                      <w:color w:val="000000"/>
-                                    </w:rPr>
-                                    <w:t>Multi-building enterprise SaaS multi-tenancy</w:t>
-                                  </w:r>
-                                </w:p>
-                              </w:tc>
-                            </w:tr>
-                            <w:tr>
-                              <w:tc>
-                                <w:tcPr>
-                                  <w:tcW w:w="4400" w:type="dxa"/>
-                                  <w:tcBorders>
-                                    <w:top w:val="single" w:sz="4" w:space="0" w:color="auto"/>
-                                    <w:left w:val="single" w:sz="4" w:space="0" w:color="auto"/>
-                                    <w:bottom w:val="single" w:sz="4" w:space="0" w:color="auto"/>
-                                    <w:right w:val="single" w:sz="4" w:space="0" w:color="auto"/>
-                                  </w:tcBorders>
-                                  <w:hideMark/>
-                                </w:tcPr>
-                                <w:p>
-                                  <w:r>
-                                    <w:rPr>
-                                      <w:color w:val="000000"/>
-                                    </w:rPr>
-                                    <w:t>PDF export of maintenance reports (CR-002, Approved)</w:t>
-                                  </w:r>
-                                </w:p>
-                              </w:tc>
-                              <w:tc>
-                                <w:tcPr>
-                                  <w:tcW w:w="4400" w:type="dxa"/>
-                                  <w:tcBorders>
-                                    <w:top w:val="single" w:sz="4" w:space="0" w:color="auto"/>
-                                    <w:left w:val="single" w:sz="4" w:space="0" w:color="auto"/>
-                                    <w:bottom w:val="single" w:sz="4" w:space="0" w:color="auto"/>
-                                    <w:right w:val="single" w:sz="4" w:space="0" w:color="auto"/>
-                                  </w:tcBorders>
-                                </w:tcPr>
-                                <w:p/>
-                              </w:tc>
-                            </w:tr>
-                            <w:tr>
-                              <w:tc>
-                                <w:tcPr>
-                                  <w:tcW w:w="4400" w:type="dxa"/>
-                                  <w:tcBorders>
-                                    <w:top w:val="single" w:sz="4" w:space="0" w:color="auto"/>
-                                    <w:left w:val="single" w:sz="4" w:space="0" w:color="auto"/>
-                                    <w:bottom w:val="single" w:sz="4" w:space="0" w:color="auto"/>
-                                    <w:right w:val="single" w:sz="4" w:space="0" w:color="auto"/>
-                                  </w:tcBorders>
-                                  <w:hideMark/>
-                                </w:tcPr>
-                                <w:p>
-                                  <w:r>
-                                    <w:rPr>
-                                      <w:color w:val="000000"/>
-                                    </w:rPr>
-                                    <w:t>Arabic / English UI localization (CR-003, Approved)</w:t>
-                                  </w:r>
-                                </w:p>
-                              </w:tc>
-                              <w:tc>
-                                <w:tcPr>
-                                  <w:tcW w:w="4400" w:type="dxa"/>
-                                  <w:tcBorders>
-                                    <w:top w:val="single" w:sz="4" w:space="0" w:color="auto"/>
-                                    <w:left w:val="single" w:sz="4" w:space="0" w:color="auto"/>
-                                    <w:bottom w:val="single" w:sz="4" w:space="0" w:color="auto"/>
-                                    <w:right w:val="single" w:sz="4" w:space="0" w:color="auto"/>
-                                  </w:tcBorders>
-                                </w:tcPr>
-                                <w:p/>
-                              </w:tc>
-                            </w:tr>
-                          </w:tbl>
-                          <w:p>
-                            <w:pPr>
-                              <w:jc w:val="center"/>
-                            </w:pPr>
-                          </w:p>
-                        </w:txbxContent>
-                      </wps:txbx>
-                      <wps:bodyPr rot="0" spcFirstLastPara="0" vertOverflow="overflow" horzOverflow="overflow" vert="horz" wrap="square" lIns="91440" tIns="45720" rIns="91440" bIns="45720" numCol="1" spcCol="0" rtlCol="1" fromWordArt="0" anchor="ctr" anchorCtr="0" forceAA="0" compatLnSpc="1">
-                        <a:prstTxWarp prst="textNoShape">
-                          <a:avLst/>
-                        </a:prstTxWarp>
-                        <a:noAutofit/>
-                      </wps:bodyPr>
-                    </wps:wsp>
-                  </a:graphicData>
-                </a:graphic>
-                <wp14:sizeRelH relativeFrom="margin">
-                  <wp14:pctWidth>0</wp14:pctWidth>
-                </wp14:sizeRelH>
-                <wp14:sizeRelV relativeFrom="margin">
-                  <wp14:pctHeight>0</wp14:pctHeight>
-                </wp14:sizeRelV>
-              </wp:anchor>
-            </w:drawing>
-          </mc:Choice>
-          <mc:Fallback>
-            <w:pict>
-              <v:shape w14:anchorId="44E98ECC" id="مخطط انسيابي: رابط 14" o:spid="_x0000_s1030" type="#_x0000_t120" style="position:absolute;margin-left:419.5pt;margin-top:55.3pt;width:9.25pt;height:10.65pt;z-index:251667456;visibility:visible;mso-wrap-style:square;mso-width-percent:0;mso-height-percent:0;mso-wrap-distance-left:9pt;mso-wrap-distance-top:0;mso-wrap-distance-right:9pt;mso-wrap-distance-bottom:0;mso-position-horizontal:absolute;mso-position-horizontal-relative:text;mso-position-vertical:absolute;mso-position-vertical-relative:text;mso-width-percent:0;mso-height-percent:0;mso-width-relative:margin;mso-height-relative:margin;v-text-anchor:middle" o:gfxdata="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" filled="f" strokecolor="white [3212]" strokeweight="1pt">
-                <v:stroke joinstyle="miter"/>
-                <v:textbox>
-                  <w:txbxContent>
-                    <w:tbl>
-                      <w:tblPr>
-                        <w:tblW w:w="8800" w:type="dxa"/>
-                        <w:tblBorders>
-                          <w:top w:val="single" w:sz="4" w:space="0" w:color="auto"/>
-                          <w:left w:val="single" w:sz="4" w:space="0" w:color="auto"/>
-                          <w:bottom w:val="single" w:sz="4" w:space="0" w:color="auto"/>
-                          <w:right w:val="single" w:sz="4" w:space="0" w:color="auto"/>
-                          <w:insideH w:val="single" w:sz="4" w:space="0" w:color="auto"/>
-                          <w:insideV w:val="single" w:sz="4" w:space="0" w:color="auto"/>
-                        </w:tblBorders>
-                        <w:tblCellMar>
-                          <w:left w:w="10" w:type="dxa"/>
-                          <w:right w:w="10" w:type="dxa"/>
-                        </w:tblCellMar>
-                        <w:tblLook w:val="04A0" w:firstRow="1" w:lastRow="0" w:firstColumn="1" w:lastColumn="0" w:noHBand="0" w:noVBand="1"/>
-                      </w:tblPr>
-                      <w:tblGrid>
-                        <w:gridCol w:w="4400"/>
-                        <w:gridCol w:w="4400"/>
-                      </w:tblGrid>
-                      <w:tr>
-                        <w:tc>
-                          <w:tcPr>
-                            <w:tcW w:w="4400" w:type="dxa"/>
-                            <w:tcBorders>
-                              <w:top w:val="single" w:sz="4" w:space="0" w:color="auto"/>
-                              <w:left w:val="single" w:sz="4" w:space="0" w:color="auto"/>
-                              <w:bottom w:val="single" w:sz="4" w:space="0" w:color="auto"/>
-                              <w:right w:val="single" w:sz="4" w:space="0" w:color="auto"/>
-                            </w:tcBorders>
-                            <w:shd w:val="clear" w:color="auto" w:fill="1F4E78"/>
-                            <w:hideMark/>
-                          </w:tcPr>
-                          <w:p>
-                            <w:r>
-                              <w:rPr>
-                                <w:b/>
-                                <w:bCs/>
-                                <w:color w:val="FFFFFF"/>
-                              </w:rPr>
-                              <w:t>In Scope</w:t>
-                            </w:r>
-                          </w:p>
-                        </w:tc>
-                        <w:tc>
-                          <w:tcPr>
-                            <w:tcW w:w="4400" w:type="dxa"/>
-                            <w:tcBorders>
-                              <w:top w:val="single" w:sz="4" w:space="0" w:color="auto"/>
-                              <w:left w:val="single" w:sz="4" w:space="0" w:color="auto"/>
-                              <w:bottom w:val="single" w:sz="4" w:space="0" w:color="auto"/>
-                              <w:right w:val="single" w:sz="4" w:space="0" w:color="auto"/>
-                            </w:tcBorders>
-                            <w:shd w:val="clear" w:color="auto" w:fill="1F4E78"/>
-                            <w:hideMark/>
-                          </w:tcPr>
-                          <w:p>
-                            <w:r>
-                              <w:rPr>
-                                <w:b/>
-                                <w:bCs/>
-                                <w:color w:val="FFFFFF"/>
-                              </w:rPr>
-                              <w:t>Out of Scope</w:t>
-                            </w:r>
-                          </w:p>
-                        </w:tc>
-                      </w:tr>
-                      <w:tr>
-                        <w:tc>
-                          <w:tcPr>
-                            <w:tcW w:w="4400" w:type="dxa"/>
-                            <w:tcBorders>
-                              <w:top w:val="single" w:sz="4" w:space="0" w:color="auto"/>
-                              <w:left w:val="single" w:sz="4" w:space="0" w:color="auto"/>
-                              <w:bottom w:val="single" w:sz="4" w:space="0" w:color="auto"/>
-                              <w:right w:val="single" w:sz="4" w:space="0" w:color="auto"/>
-                            </w:tcBorders>
-                            <w:hideMark/>
-                          </w:tcPr>
-                          <w:p>
-                            <w:r>
-                              <w:rPr>
-                                <w:color w:val="000000"/>
-                              </w:rPr>
-                              <w:t>Apartment &amp; occupancy management (Vacant / Occupied / Maintenance)</w:t>
-                            </w:r>
-                          </w:p>
-                        </w:tc>
-                        <w:tc>
-                          <w:tcPr>
-                            <w:tcW w:w="4400" w:type="dxa"/>
-                            <w:tcBorders>
-                              <w:top w:val="single" w:sz="4" w:space="0" w:color="auto"/>
-                              <w:left w:val="single" w:sz="4" w:space="0" w:color="auto"/>
-                              <w:bottom w:val="single" w:sz="4" w:space="0" w:color="auto"/>
-                              <w:right w:val="single" w:sz="4" w:space="0" w:color="auto"/>
-                            </w:tcBorders>
-                            <w:hideMark/>
-                          </w:tcPr>
-                          <w:p>
-                            <w:r>
-                              <w:rPr>
-                                <w:color w:val="000000"/>
-                              </w:rPr>
-                              <w:t>Online payment gateways (</w:t>
-                            </w:r>
-                            <w:proofErr w:type="spellStart"/>
-                            <w:r>
-                              <w:rPr>
-                                <w:color w:val="000000"/>
-                              </w:rPr>
-                              <w:t>Jaib</w:t>
-                            </w:r>
-                            <w:proofErr w:type="spellEnd"/>
-                            <w:r>
-                              <w:rPr>
-                                <w:color w:val="000000"/>
-                              </w:rPr>
-                              <w:t xml:space="preserve">, </w:t>
-                            </w:r>
-                            <w:proofErr w:type="spellStart"/>
-                            <w:r>
-                              <w:rPr>
-                                <w:color w:val="000000"/>
-                              </w:rPr>
-                              <w:t>OneCash</w:t>
-                            </w:r>
-                            <w:proofErr w:type="spellEnd"/>
-                            <w:r>
-                              <w:rPr>
-                                <w:color w:val="000000"/>
-                              </w:rPr>
-                              <w:t>, Stripe, banking APIs) — CR-001 Rejected</w:t>
-                            </w:r>
-                          </w:p>
-                        </w:tc>
-                      </w:tr>
-                      <w:tr>
-                        <w:tc>
-                          <w:tcPr>
-                            <w:tcW w:w="4400" w:type="dxa"/>
-                            <w:tcBorders>
-                              <w:top w:val="single" w:sz="4" w:space="0" w:color="auto"/>
-                              <w:left w:val="single" w:sz="4" w:space="0" w:color="auto"/>
-                              <w:bottom w:val="single" w:sz="4" w:space="0" w:color="auto"/>
-                              <w:right w:val="single" w:sz="4" w:space="0" w:color="auto"/>
-                            </w:tcBorders>
-                            <w:hideMark/>
-                          </w:tcPr>
-                          <w:p>
-                            <w:r>
-                              <w:rPr>
-                                <w:color w:val="000000"/>
-                              </w:rPr>
-                              <w:t>Rent &amp; payment tracking (cash / dockets, overdue balances, receipts)</w:t>
-                            </w:r>
-                          </w:p>
-                        </w:tc>
-                        <w:tc>
-                          <w:tcPr>
-                            <w:tcW w:w="4400" w:type="dxa"/>
-                            <w:tcBorders>
-                              <w:top w:val="single" w:sz="4" w:space="0" w:color="auto"/>
-                              <w:left w:val="single" w:sz="4" w:space="0" w:color="auto"/>
-                              <w:bottom w:val="single" w:sz="4" w:space="0" w:color="auto"/>
-                              <w:right w:val="single" w:sz="4" w:space="0" w:color="auto"/>
-                            </w:tcBorders>
-                            <w:hideMark/>
-                          </w:tcPr>
-                          <w:p>
-                            <w:r>
-                              <w:rPr>
-                                <w:color w:val="000000"/>
-                              </w:rPr>
-                              <w:t xml:space="preserve">Cloud </w:t>
-                            </w:r>
-                            <w:r>
-                              <w:rPr>
-                                <w:color w:val="000000"/>
-                              </w:rPr>
-                              <w:t>database (MSSQL Server)</w:t>
-                            </w:r>
-                            <w:r>
-                              <w:rPr>
-                                <w:color w:val="000000"/>
-                              </w:rPr>
-                              <w:t xml:space="preserve"> synchronization and remote APIs</w:t>
-                            </w:r>
-                          </w:p>
-                        </w:tc>
-                      </w:tr>
-                      <w:tr>
-                        <w:tc>
-                          <w:tcPr>
-                            <w:tcW w:w="4400" w:type="dxa"/>
-                            <w:tcBorders>
-                              <w:top w:val="single" w:sz="4" w:space="0" w:color="auto"/>
-                              <w:left w:val="single" w:sz="4" w:space="0" w:color="auto"/>
-                              <w:bottom w:val="single" w:sz="4" w:space="0" w:color="auto"/>
-                              <w:right w:val="single" w:sz="4" w:space="0" w:color="auto"/>
-                            </w:tcBorders>
-                            <w:hideMark/>
-                          </w:tcPr>
-                          <w:p>
-                            <w:r>
-                              <w:rPr>
-                                <w:color w:val="000000"/>
-                              </w:rPr>
-                              <w:t>Maintenance &amp; issue logging (Open / In Progress / Resolved)</w:t>
-                            </w:r>
-                          </w:p>
-                        </w:tc>
-                        <w:tc>
-                          <w:tcPr>
-                            <w:tcW w:w="4400" w:type="dxa"/>
-                            <w:tcBorders>
-                              <w:top w:val="single" w:sz="4" w:space="0" w:color="auto"/>
-                              <w:left w:val="single" w:sz="4" w:space="0" w:color="auto"/>
-                              <w:bottom w:val="single" w:sz="4" w:space="0" w:color="auto"/>
-                              <w:right w:val="single" w:sz="4" w:space="0" w:color="auto"/>
-                            </w:tcBorders>
-                            <w:hideMark/>
-                          </w:tcPr>
-                          <w:p>
-                            <w:r>
-                              <w:rPr>
-                                <w:color w:val="000000"/>
-                              </w:rPr>
-                              <w:t>Tenant mobile applications (iOS / Android)</w:t>
-                            </w:r>
-                          </w:p>
-                        </w:tc>
-                      </w:tr>
-                      <w:tr>
-                        <w:tc>
-                          <w:tcPr>
-                            <w:tcW w:w="4400" w:type="dxa"/>
-                            <w:tcBorders>
-                              <w:top w:val="single" w:sz="4" w:space="0" w:color="auto"/>
-                              <w:left w:val="single" w:sz="4" w:space="0" w:color="auto"/>
-                              <w:bottom w:val="single" w:sz="4" w:space="0" w:color="auto"/>
-                              <w:right w:val="single" w:sz="4" w:space="0" w:color="auto"/>
-                            </w:tcBorders>
-                            <w:hideMark/>
-                          </w:tcPr>
-                          <w:p>
-                            <w:r>
-                              <w:rPr>
-                                <w:color w:val="000000"/>
-                              </w:rPr>
-                              <w:t>Package &amp; parcel receiving and pickup tracking</w:t>
-                            </w:r>
-                          </w:p>
-                        </w:tc>
-                        <w:tc>
-                          <w:tcPr>
-                            <w:tcW w:w="4400" w:type="dxa"/>
-                            <w:tcBorders>
-                              <w:top w:val="single" w:sz="4" w:space="0" w:color="auto"/>
-                              <w:left w:val="single" w:sz="4" w:space="0" w:color="auto"/>
-                              <w:bottom w:val="single" w:sz="4" w:space="0" w:color="auto"/>
-                              <w:right w:val="single" w:sz="4" w:space="0" w:color="auto"/>
-                            </w:tcBorders>
-                            <w:hideMark/>
-                          </w:tcPr>
-                          <w:p>
-                            <w:r>
-                              <w:rPr>
-                                <w:color w:val="000000"/>
-                              </w:rPr>
-                              <w:t>Automated SMS / email notification gateways</w:t>
-                            </w:r>
-                          </w:p>
-                        </w:tc>
-                      </w:tr>
-                      <w:tr>
-                        <w:tc>
-                          <w:tcPr>
-                            <w:tcW w:w="4400" w:type="dxa"/>
-                            <w:tcBorders>
-                              <w:top w:val="single" w:sz="4" w:space="0" w:color="auto"/>
-                              <w:left w:val="single" w:sz="4" w:space="0" w:color="auto"/>
-                              <w:bottom w:val="single" w:sz="4" w:space="0" w:color="auto"/>
-                              <w:right w:val="single" w:sz="4" w:space="0" w:color="auto"/>
-                            </w:tcBorders>
-                            <w:hideMark/>
-                          </w:tcPr>
-                          <w:p>
-                            <w:r>
-                              <w:rPr>
-                                <w:color w:val="000000"/>
-                              </w:rPr>
-                              <w:t xml:space="preserve">Local offline </w:t>
-                            </w:r>
-                            <w:r>
-                              <w:rPr>
-                                <w:color w:val="000000"/>
-                              </w:rPr>
-                              <w:t>database (MSSQL Server)</w:t>
-                            </w:r>
-                            <w:r>
-                              <w:rPr>
-                                <w:color w:val="000000"/>
-                              </w:rPr>
-                              <w:t xml:space="preserve"> with backup and restore utilities</w:t>
-                            </w:r>
-                          </w:p>
-                        </w:tc>
-                        <w:tc>
-                          <w:tcPr>
-                            <w:tcW w:w="4400" w:type="dxa"/>
-                            <w:tcBorders>
-                              <w:top w:val="single" w:sz="4" w:space="0" w:color="auto"/>
-                              <w:left w:val="single" w:sz="4" w:space="0" w:color="auto"/>
-                              <w:bottom w:val="single" w:sz="4" w:space="0" w:color="auto"/>
-                              <w:right w:val="single" w:sz="4" w:space="0" w:color="auto"/>
-                            </w:tcBorders>
-                            <w:hideMark/>
-                          </w:tcPr>
-                          <w:p>
-                            <w:r>
-                              <w:rPr>
-                                <w:color w:val="000000"/>
-                              </w:rPr>
-                              <w:t>Multi-building enterprise SaaS multi-tenancy</w:t>
-                            </w:r>
-                          </w:p>
-                        </w:tc>
-                      </w:tr>
-                      <w:tr>
-                        <w:tc>
-                          <w:tcPr>
-                            <w:tcW w:w="4400" w:type="dxa"/>
-                            <w:tcBorders>
-                              <w:top w:val="single" w:sz="4" w:space="0" w:color="auto"/>
-                              <w:left w:val="single" w:sz="4" w:space="0" w:color="auto"/>
-                              <w:bottom w:val="single" w:sz="4" w:space="0" w:color="auto"/>
-                              <w:right w:val="single" w:sz="4" w:space="0" w:color="auto"/>
-                            </w:tcBorders>
-                            <w:hideMark/>
-                          </w:tcPr>
-                          <w:p>
-                            <w:r>
-                              <w:rPr>
-                                <w:color w:val="000000"/>
-                              </w:rPr>
-                              <w:t>PDF export of maintenance reports (CR-002, Approved)</w:t>
-                            </w:r>
-                          </w:p>
-                        </w:tc>
-                        <w:tc>
-                          <w:tcPr>
-                            <w:tcW w:w="4400" w:type="dxa"/>
-                            <w:tcBorders>
-                              <w:top w:val="single" w:sz="4" w:space="0" w:color="auto"/>
-                              <w:left w:val="single" w:sz="4" w:space="0" w:color="auto"/>
-                              <w:bottom w:val="single" w:sz="4" w:space="0" w:color="auto"/>
-                              <w:right w:val="single" w:sz="4" w:space="0" w:color="auto"/>
-                            </w:tcBorders>
-                          </w:tcPr>
-                          <w:p/>
-                        </w:tc>
-                      </w:tr>
-                      <w:tr>
-                        <w:tc>
-                          <w:tcPr>
-                            <w:tcW w:w="4400" w:type="dxa"/>
-                            <w:tcBorders>
-                              <w:top w:val="single" w:sz="4" w:space="0" w:color="auto"/>
-                              <w:left w:val="single" w:sz="4" w:space="0" w:color="auto"/>
-                              <w:bottom w:val="single" w:sz="4" w:space="0" w:color="auto"/>
-                              <w:right w:val="single" w:sz="4" w:space="0" w:color="auto"/>
-                            </w:tcBorders>
-                            <w:hideMark/>
-                          </w:tcPr>
-                          <w:p>
-                            <w:r>
-                              <w:rPr>
-                                <w:color w:val="000000"/>
-                              </w:rPr>
-                              <w:t>Arabic / English UI localization (CR-003, Approved)</w:t>
-                            </w:r>
-                          </w:p>
-                        </w:tc>
-                        <w:tc>
-                          <w:tcPr>
-                            <w:tcW w:w="4400" w:type="dxa"/>
-                            <w:tcBorders>
-                              <w:top w:val="single" w:sz="4" w:space="0" w:color="auto"/>
-                              <w:left w:val="single" w:sz="4" w:space="0" w:color="auto"/>
-                              <w:bottom w:val="single" w:sz="4" w:space="0" w:color="auto"/>
-                              <w:right w:val="single" w:sz="4" w:space="0" w:color="auto"/>
-                            </w:tcBorders>
-                          </w:tcPr>
-                          <w:p/>
-                        </w:tc>
-                      </w:tr>
-                    </w:tbl>
-                    <w:p>
-                      <w:pPr>
-                        <w:jc w:val="center"/>
-                      </w:pPr>
-                    </w:p>
-                  </w:txbxContent>
-                </v:textbox>
-              </v:shape>
-            </w:pict>
-          </mc:Fallback>
-        </mc:AlternateContent>
-      </w:r>
-      <w:r>
-        <w:rPr>
-          <w:rFonts w:asciiTheme="minorHAnsi" w:hAnsiTheme="minorHAnsi" w:cstheme="minorHAnsi"/>
-          <w:noProof/>
-        </w:rPr>
-        <mc:AlternateContent>
-          <mc:Choice Requires="wps">
-            <w:drawing>
-              <wp:anchor distT="0" distB="0" distL="114300" distR="114300" simplePos="0" relativeHeight="251664384" behindDoc="0" locked="0" layoutInCell="1" allowOverlap="1" wp14:anchorId="22728B11" wp14:editId="3DFBAE59">
+              <wp:anchor distT="0" distB="0" distL="114300" distR="114300" simplePos="0" relativeHeight="251664384" behindDoc="0" locked="0" layoutInCell="1" allowOverlap="1" wp14:anchorId="22728B11" wp14:editId="21D9BE7B">
                 <wp:simplePos x="0" y="0"/>
                 <wp:positionH relativeFrom="column">
                   <wp:posOffset>5383607</wp:posOffset>
@@ -39370,7 +36842,7 @@
           </mc:Choice>
           <mc:Fallback>
             <w:pict>
-              <v:shapetype w14:anchorId="69492506" id="_x0000_t32" coordsize="21600,21600" o:spt="32" o:oned="t" path="m,l21600,21600e" filled="f">
+              <v:shapetype w14:anchorId="0D76EF8E" id="_x0000_t32" coordsize="21600,21600" o:spt="32" o:oned="t" path="m,l21600,21600e" filled="f">
                 <v:path arrowok="t" fillok="f" o:connecttype="none"/>
                 <o:lock v:ext="edit" shapetype="t"/>
               </v:shapetype>
@@ -39380,95 +36852,6 @@
             </w:pict>
           </mc:Fallback>
         </mc:AlternateContent>
-      </w:r>
-      <w:r>
-        <w:rPr>
-          <w:rFonts w:asciiTheme="minorHAnsi" w:hAnsiTheme="minorHAnsi" w:cstheme="minorHAnsi"/>
-          <w:noProof/>
-        </w:rPr>
-        <w:drawing>
-          <wp:inline distT="0" distB="0" distL="0" distR="0" wp14:anchorId="2A1EF0D6" wp14:editId="1BB348B1">
-            <wp:extent cx="5334000" cy="4808483"/>
-            <wp:effectExtent l="0" t="0" r="0" b="0"/>
-            <wp:docPr id="13" name="صورة 13"/>
-            <wp:cNvGraphicFramePr>
-              <a:graphicFrameLocks xmlns:a="http://schemas.openxmlformats.org/drawingml/2006/main" noChangeAspect="1"/>
-            </wp:cNvGraphicFramePr>
-            <a:graphic xmlns:a="http://schemas.openxmlformats.org/drawingml/2006/main">
-              <a:graphicData uri="http://schemas.openxmlformats.org/drawingml/2006/picture">
-                <pic:pic xmlns:pic="http://schemas.openxmlformats.org/drawingml/2006/picture">
-                  <pic:nvPicPr>
-                    <pic:cNvPr id="0" name=""/>
-                    <pic:cNvPicPr>
-                      <a:picLocks noChangeAspect="1" noChangeArrowheads="1"/>
-                    </pic:cNvPicPr>
-                  </pic:nvPicPr>
-                  <pic:blipFill>
-                    <a:blip r:embed="rId11"/>
-                    <a:srcRect/>
-                    <a:stretch>
-                      <a:fillRect/>
-                    </a:stretch>
-                  </pic:blipFill>
-                  <pic:spPr bwMode="auto">
-                    <a:xfrm>
-                      <a:off x="0" y="0"/>
-                      <a:ext cx="5334000" cy="4808483"/>
-                    </a:xfrm>
-                    <a:prstGeom prst="rect">
-                      <a:avLst/>
-                    </a:prstGeom>
-                  </pic:spPr>
-                </pic:pic>
-              </a:graphicData>
-            </a:graphic>
-          </wp:inline>
-        </w:drawing>
-      </w:r>
-      <w:r>
-        <w:rPr>
-          <w:rFonts w:asciiTheme="minorHAnsi" w:hAnsiTheme="minorHAnsi" w:cstheme="minorHAnsi"/>
-          <w:noProof/>
-        </w:rPr>
-        <w:lastRenderedPageBreak/>
-        <w:drawing>
-          <wp:inline distT="0" distB="0" distL="0" distR="0" wp14:anchorId="58D77FEC" wp14:editId="61B64C4C">
-            <wp:extent cx="5334000" cy="4808483"/>
-            <wp:effectExtent l="0" t="0" r="0" b="0"/>
-            <wp:docPr id="3" name="صورة 3"/>
-            <wp:cNvGraphicFramePr>
-              <a:graphicFrameLocks xmlns:a="http://schemas.openxmlformats.org/drawingml/2006/main" noChangeAspect="1"/>
-            </wp:cNvGraphicFramePr>
-            <a:graphic xmlns:a="http://schemas.openxmlformats.org/drawingml/2006/main">
-              <a:graphicData uri="http://schemas.openxmlformats.org/drawingml/2006/picture">
-                <pic:pic xmlns:pic="http://schemas.openxmlformats.org/drawingml/2006/picture">
-                  <pic:nvPicPr>
-                    <pic:cNvPr id="0" name=""/>
-                    <pic:cNvPicPr>
-                      <a:picLocks noChangeAspect="1" noChangeArrowheads="1"/>
-                    </pic:cNvPicPr>
-                  </pic:nvPicPr>
-                  <pic:blipFill>
-                    <a:blip r:embed="rId11"/>
-                    <a:srcRect/>
-                    <a:stretch>
-                      <a:fillRect/>
-                    </a:stretch>
-                  </pic:blipFill>
-                  <pic:spPr bwMode="auto">
-                    <a:xfrm>
-                      <a:off x="0" y="0"/>
-                      <a:ext cx="5334000" cy="4808483"/>
-                    </a:xfrm>
-                    <a:prstGeom prst="rect">
-                      <a:avLst/>
-                    </a:prstGeom>
-                  </pic:spPr>
-                </pic:pic>
-              </a:graphicData>
-            </a:graphic>
-          </wp:inline>
-        </w:drawing>
       </w:r>
     </w:p>
     <w:p>
@@ -39644,10 +37027,10 @@
         </w:rPr>
         <w:lastRenderedPageBreak/>
         <w:drawing>
-          <wp:inline distT="0" distB="0" distL="0" distR="0" wp14:anchorId="5ADAF002" wp14:editId="1C3672AB">
-            <wp:extent cx="2857500" cy="4395574"/>
+          <wp:inline distT="0" distB="0" distL="0" distR="0" wp14:anchorId="17CEFFD0" wp14:editId="27062043">
+            <wp:extent cx="6390640" cy="3245485"/>
             <wp:effectExtent l="0" t="0" r="0" b="0"/>
-            <wp:docPr id="5" name="صورة 5"/>
+            <wp:docPr id="17" name="صورة 17"/>
             <wp:cNvGraphicFramePr>
               <a:graphicFrameLocks xmlns:a="http://schemas.openxmlformats.org/drawingml/2006/main" noChangeAspect="1"/>
             </wp:cNvGraphicFramePr>
@@ -39655,13 +37038,19 @@
               <a:graphicData uri="http://schemas.openxmlformats.org/drawingml/2006/picture">
                 <pic:pic xmlns:pic="http://schemas.openxmlformats.org/drawingml/2006/picture">
                   <pic:nvPicPr>
-                    <pic:cNvPr id="0" name=""/>
+                    <pic:cNvPr id="0" name="Picture 4"/>
                     <pic:cNvPicPr>
                       <a:picLocks noChangeAspect="1" noChangeArrowheads="1"/>
                     </pic:cNvPicPr>
                   </pic:nvPicPr>
                   <pic:blipFill>
-                    <a:blip r:embed="rId13"/>
+                    <a:blip r:embed="rId13">
+                      <a:extLst>
+                        <a:ext uri="{28A0092B-C50C-407E-A947-70E740481C1C}">
+                          <a14:useLocalDpi xmlns:a14="http://schemas.microsoft.com/office/drawing/2010/main" val="0"/>
+                        </a:ext>
+                      </a:extLst>
+                    </a:blip>
                     <a:srcRect/>
                     <a:stretch>
                       <a:fillRect/>
@@ -39670,11 +37059,15 @@
                   <pic:spPr bwMode="auto">
                     <a:xfrm>
                       <a:off x="0" y="0"/>
-                      <a:ext cx="2857500" cy="4395574"/>
+                      <a:ext cx="6390640" cy="3245485"/>
                     </a:xfrm>
                     <a:prstGeom prst="rect">
                       <a:avLst/>
                     </a:prstGeom>
+                    <a:noFill/>
+                    <a:ln>
+                      <a:noFill/>
+                    </a:ln>
                   </pic:spPr>
                 </pic:pic>
               </a:graphicData>
@@ -42701,7 +40094,6 @@
     <w:pPr>
       <w:jc w:val="right"/>
       <w:rPr>
-        <w:rFonts w:hint="cs"/>
         <w:noProof/>
         <w:rtl/>
       </w:rPr>
@@ -43751,6 +41143,7 @@
   <w:style w:type="character" w:default="1" w:styleId="a0">
     <w:name w:val="Default Paragraph Font"/>
     <w:uiPriority w:val="1"/>
+    <w:semiHidden/>
     <w:unhideWhenUsed/>
   </w:style>
   <w:style w:type="table" w:default="1" w:styleId="a1">

</xml_diff>